<commit_message>
Revise Task 2 write-up for external readers and reviewer feedback
Cuts insider references and em dashes, switches to A4, and folds in
reviewer feedback: data model, consent, output format, fairness,
thin-match handling, in-email approval, named AI model tiers, and a
closing risk note.

Co-Authored-By: Claude Sonnet 5 <noreply@anthropic.com>
</commit_message>
<xml_diff>
--- a/task2/task2-startup-matchmaking.docx
+++ b/task2/task2-startup-matchmaking.docx
@@ -5,52 +5,64 @@
     <w:p>
       <w:pPr>
         <w:pStyle w:val="Heading1"/>
-        <w:spacing w:after="30"/>
+        <w:spacing w:after="25"/>
       </w:pPr>
       <w:r>
         <w:rPr>
           <w:b/>
           <w:bCs/>
           <w:color w:val="111827"/>
-          <w:sz w:val="30"/>
-          <w:szCs w:val="30"/>
+          <w:sz w:val="29"/>
+          <w:szCs w:val="29"/>
         </w:rPr>
         <w:t>Startup Matchmaking: Automation Approach</w:t>
       </w:r>
     </w:p>
     <w:p>
       <w:pPr>
-        <w:spacing w:after="160"/>
+        <w:spacing w:after="140"/>
       </w:pPr>
       <w:r>
         <w:rPr>
           <w:i/>
           <w:iCs/>
           <w:color w:val="6B7280"/>
-          <w:sz w:val="19"/>
-          <w:szCs w:val="19"/>
+          <w:sz w:val="18"/>
+          <w:szCs w:val="18"/>
         </w:rPr>
         <w:t>Task 2 write-up: approach and architecture</w:t>
       </w:r>
     </w:p>
     <w:p>
       <w:pPr>
-        <w:spacing w:after="100"/>
-      </w:pPr>
-      <w:r>
+        <w:spacing w:after="90"/>
+      </w:pPr>
+      <w:r>
+        <w:rPr>
+          <w:sz w:val="19"/>
+          <w:szCs w:val="19"/>
+        </w:rPr>
         <w:t>Today, matching an incoming request to suitable startups means opening a 600+ row Excel file and manually checking it against whatever the requester asked for. That takes about 7 hours a week across 10+ requests. The goal here is to turn that process, read</w:t>
       </w:r>
       <w:r>
+        <w:rPr>
+          <w:sz w:val="19"/>
+          <w:szCs w:val="19"/>
+        </w:rPr>
         <w:t xml:space="preserve"> the email, search the sheet, write a reply, into a short pipeline with one required human checkpoint before anything goes out. We already run and fully control a Hetzner server for the startin.lv website, so this tool is designed to run there as its own s</w:t>
       </w:r>
       <w:r>
+        <w:rPr>
+          <w:sz w:val="19"/>
+          <w:szCs w:val="19"/>
+        </w:rPr>
         <w:t>elf-hosted service, rather than adding a stack of new paid subscriptions.</w:t>
       </w:r>
     </w:p>
     <w:p>
       <w:pPr>
         <w:pStyle w:val="Heading2"/>
-        <w:spacing w:before="200" w:after="70"/>
+        <w:spacing w:before="180" w:after="60"/>
       </w:pPr>
       <w:r>
         <w:rPr>
@@ -63,7 +75,7 @@
     </w:p>
     <w:tbl>
       <w:tblPr>
-        <w:tblW w:w="9360" w:type="dxa"/>
+        <w:tblW w:w="10100" w:type="dxa"/>
         <w:tblBorders>
           <w:top w:val="single" w:sz="4" w:space="0" w:color="auto"/>
           <w:left w:val="single" w:sz="4" w:space="0" w:color="auto"/>
@@ -76,11 +88,11 @@
           <w:left w:w="10" w:type="dxa"/>
           <w:right w:w="10" w:type="dxa"/>
         </w:tblCellMar>
-        <w:tblLook w:val="04A0" w:firstRow="1" w:lastRow="0" w:firstColumn="1" w:lastColumn="0" w:noHBand="0" w:noVBand="1"/>
+        <w:tblLook w:val="0000" w:firstRow="0" w:lastRow="0" w:firstColumn="0" w:lastColumn="0" w:noHBand="0" w:noVBand="0"/>
       </w:tblPr>
       <w:tblGrid>
-        <w:gridCol w:w="2200"/>
-        <w:gridCol w:w="7160"/>
+        <w:gridCol w:w="2000"/>
+        <w:gridCol w:w="8100"/>
       </w:tblGrid>
       <w:tr>
         <w:tblPrEx>
@@ -91,12 +103,12 @@
         </w:tblPrEx>
         <w:tc>
           <w:tcPr>
-            <w:tcW w:w="2200" w:type="dxa"/>
+            <w:tcW w:w="2000" w:type="dxa"/>
             <w:shd w:val="clear" w:color="auto" w:fill="F3F4F6"/>
             <w:tcMar>
-              <w:top w:w="70" w:type="dxa"/>
-              <w:left w:w="100" w:type="dxa"/>
-              <w:bottom w:w="70" w:type="dxa"/>
+              <w:top w:w="65" w:type="dxa"/>
+              <w:left w:w="100" w:type="dxa"/>
+              <w:bottom w:w="65" w:type="dxa"/>
               <w:right w:w="100" w:type="dxa"/>
             </w:tcMar>
           </w:tcPr>
@@ -105,8 +117,8 @@
               <w:rPr>
                 <w:b/>
                 <w:bCs/>
-                <w:sz w:val="18"/>
-                <w:szCs w:val="18"/>
+                <w:sz w:val="17"/>
+                <w:szCs w:val="17"/>
               </w:rPr>
               <w:t>1. Intake</w:t>
             </w:r>
@@ -114,26 +126,26 @@
         </w:tc>
         <w:tc>
           <w:tcPr>
-            <w:tcW w:w="7160" w:type="dxa"/>
-            <w:tcMar>
-              <w:top w:w="70" w:type="dxa"/>
-              <w:left w:w="100" w:type="dxa"/>
-              <w:bottom w:w="70" w:type="dxa"/>
-              <w:right w:w="100" w:type="dxa"/>
-            </w:tcMar>
-          </w:tcPr>
-          <w:p>
-            <w:r>
-              <w:rPr>
-                <w:sz w:val="18"/>
-                <w:szCs w:val="18"/>
+            <w:tcW w:w="8100" w:type="dxa"/>
+            <w:tcMar>
+              <w:top w:w="65" w:type="dxa"/>
+              <w:left w:w="100" w:type="dxa"/>
+              <w:bottom w:w="65" w:type="dxa"/>
+              <w:right w:w="100" w:type="dxa"/>
+            </w:tcMar>
+          </w:tcPr>
+          <w:p>
+            <w:r>
+              <w:rPr>
+                <w:sz w:val="17"/>
+                <w:szCs w:val="17"/>
               </w:rPr>
               <w:t>Requests arrive at the team's existing mailbox. A small script checks it every few minutes and passes new messages to the matchmaking app, so the</w:t>
             </w:r>
             <w:r>
               <w:rPr>
-                <w:sz w:val="18"/>
-                <w:szCs w:val="18"/>
+                <w:sz w:val="17"/>
+                <w:szCs w:val="17"/>
               </w:rPr>
               <w:t>re is no separate inbound-email service to pay for. Duplicate emails are ignored automatically.</w:t>
             </w:r>
@@ -149,12 +161,12 @@
         </w:tblPrEx>
         <w:tc>
           <w:tcPr>
-            <w:tcW w:w="2200" w:type="dxa"/>
+            <w:tcW w:w="2000" w:type="dxa"/>
             <w:shd w:val="clear" w:color="auto" w:fill="F3F4F6"/>
             <w:tcMar>
-              <w:top w:w="70" w:type="dxa"/>
-              <w:left w:w="100" w:type="dxa"/>
-              <w:bottom w:w="70" w:type="dxa"/>
+              <w:top w:w="65" w:type="dxa"/>
+              <w:left w:w="100" w:type="dxa"/>
+              <w:bottom w:w="65" w:type="dxa"/>
               <w:right w:w="100" w:type="dxa"/>
             </w:tcMar>
           </w:tcPr>
@@ -163,8 +175,8 @@
               <w:rPr>
                 <w:b/>
                 <w:bCs/>
-                <w:sz w:val="18"/>
-                <w:szCs w:val="18"/>
+                <w:sz w:val="17"/>
+                <w:szCs w:val="17"/>
               </w:rPr>
               <w:t>2. Understand the ask</w:t>
             </w:r>
@@ -172,28 +184,35 @@
         </w:tc>
         <w:tc>
           <w:tcPr>
-            <w:tcW w:w="7160" w:type="dxa"/>
-            <w:tcMar>
-              <w:top w:w="70" w:type="dxa"/>
-              <w:left w:w="100" w:type="dxa"/>
-              <w:bottom w:w="70" w:type="dxa"/>
-              <w:right w:w="100" w:type="dxa"/>
-            </w:tcMar>
-          </w:tcPr>
-          <w:p>
-            <w:r>
-              <w:rPr>
-                <w:sz w:val="18"/>
-                <w:szCs w:val="18"/>
-              </w:rPr>
-              <w:t>Claude reads the free-text email and pulls out structured criteria: sector, stage, geography, ticket size, and deadline. It also separate</w:t>
-            </w:r>
-            <w:r>
-              <w:rPr>
-                <w:sz w:val="18"/>
-                <w:szCs w:val="18"/>
-              </w:rPr>
-              <w:t>s must-have requirements from nice-to-haves. If a request is unclear, the system drafts a clarifying question instead of guessing.</w:t>
+            <w:tcW w:w="8100" w:type="dxa"/>
+            <w:tcMar>
+              <w:top w:w="65" w:type="dxa"/>
+              <w:left w:w="100" w:type="dxa"/>
+              <w:bottom w:w="65" w:type="dxa"/>
+              <w:right w:w="100" w:type="dxa"/>
+            </w:tcMar>
+          </w:tcPr>
+          <w:p>
+            <w:r>
+              <w:rPr>
+                <w:sz w:val="17"/>
+                <w:szCs w:val="17"/>
+              </w:rPr>
+              <w:t>A fast, inexpensive model reads the free-text email and pulls out structured criteria: sector, stage, geography, ticket size, and deadlin</w:t>
+            </w:r>
+            <w:r>
+              <w:rPr>
+                <w:sz w:val="17"/>
+                <w:szCs w:val="17"/>
+              </w:rPr>
+              <w:t>e. Each value is checked against the known sector and stage lists; anything it doesn't recognise is reported rather than invented. It also separates must-have requirements from nice-to-haves. If a request is unclear, the system drafts a clarifying question</w:t>
+            </w:r>
+            <w:r>
+              <w:rPr>
+                <w:sz w:val="17"/>
+                <w:szCs w:val="17"/>
+              </w:rPr>
+              <w:t xml:space="preserve"> instead of guessing.</w:t>
             </w:r>
           </w:p>
         </w:tc>
@@ -207,12 +226,12 @@
         </w:tblPrEx>
         <w:tc>
           <w:tcPr>
-            <w:tcW w:w="2200" w:type="dxa"/>
+            <w:tcW w:w="2000" w:type="dxa"/>
             <w:shd w:val="clear" w:color="auto" w:fill="F3F4F6"/>
             <w:tcMar>
-              <w:top w:w="70" w:type="dxa"/>
-              <w:left w:w="100" w:type="dxa"/>
-              <w:bottom w:w="70" w:type="dxa"/>
+              <w:top w:w="65" w:type="dxa"/>
+              <w:left w:w="100" w:type="dxa"/>
+              <w:bottom w:w="65" w:type="dxa"/>
               <w:right w:w="100" w:type="dxa"/>
             </w:tcMar>
           </w:tcPr>
@@ -221,8 +240,8 @@
               <w:rPr>
                 <w:b/>
                 <w:bCs/>
-                <w:sz w:val="18"/>
-                <w:szCs w:val="18"/>
+                <w:sz w:val="17"/>
+                <w:szCs w:val="17"/>
               </w:rPr>
               <w:t>3. Match</w:t>
             </w:r>
@@ -230,28 +249,35 @@
         </w:tc>
         <w:tc>
           <w:tcPr>
-            <w:tcW w:w="7160" w:type="dxa"/>
-            <w:tcMar>
-              <w:top w:w="70" w:type="dxa"/>
-              <w:left w:w="100" w:type="dxa"/>
-              <w:bottom w:w="70" w:type="dxa"/>
-              <w:right w:w="100" w:type="dxa"/>
-            </w:tcMar>
-          </w:tcPr>
-          <w:p>
-            <w:r>
-              <w:rPr>
-                <w:sz w:val="18"/>
-                <w:szCs w:val="18"/>
-              </w:rPr>
-              <w:t>Startups that fail a must-have criterion are excluded. The rest are ranked by a rules-based scoring system, the sam</w:t>
-            </w:r>
-            <w:r>
-              <w:rPr>
-                <w:sz w:val="18"/>
-                <w:szCs w:val="18"/>
-              </w:rPr>
-              <w:t>e approach used in the Task 1 prototype submitted alongside this document, so the reasoning behind every rank stays visible instead of hidden inside a model.</w:t>
+            <w:tcW w:w="8100" w:type="dxa"/>
+            <w:tcMar>
+              <w:top w:w="65" w:type="dxa"/>
+              <w:left w:w="100" w:type="dxa"/>
+              <w:bottom w:w="65" w:type="dxa"/>
+              <w:right w:w="100" w:type="dxa"/>
+            </w:tcMar>
+          </w:tcPr>
+          <w:p>
+            <w:r>
+              <w:rPr>
+                <w:sz w:val="17"/>
+                <w:szCs w:val="17"/>
+              </w:rPr>
+              <w:t>Startups that fail a must-have criterion are excluded. The rest are ranked by a rules-based scoring system, the same approach used in the Task 1 prototype submitted alongside this document, so the reasoning behind every rank</w:t>
+            </w:r>
+            <w:r>
+              <w:rPr>
+                <w:sz w:val="17"/>
+                <w:szCs w:val="17"/>
+              </w:rPr>
+              <w:t xml:space="preserve"> stays visible instead of hidden in a model. If fewer than five startups qualify, the search widens automatically, relaxing nice-to-haves first and then stage or geography, and the shortlist is labelled as a wider search rather than silently returning weak</w:t>
+            </w:r>
+            <w:r>
+              <w:rPr>
+                <w:sz w:val="17"/>
+                <w:szCs w:val="17"/>
+              </w:rPr>
+              <w:t xml:space="preserve"> matches. A genuinely empty result goes straight to a person.</w:t>
             </w:r>
           </w:p>
         </w:tc>
@@ -265,12 +291,12 @@
         </w:tblPrEx>
         <w:tc>
           <w:tcPr>
-            <w:tcW w:w="2200" w:type="dxa"/>
+            <w:tcW w:w="2000" w:type="dxa"/>
             <w:shd w:val="clear" w:color="auto" w:fill="F3F4F6"/>
             <w:tcMar>
-              <w:top w:w="70" w:type="dxa"/>
-              <w:left w:w="100" w:type="dxa"/>
-              <w:bottom w:w="70" w:type="dxa"/>
+              <w:top w:w="65" w:type="dxa"/>
+              <w:left w:w="100" w:type="dxa"/>
+              <w:bottom w:w="65" w:type="dxa"/>
               <w:right w:w="100" w:type="dxa"/>
             </w:tcMar>
           </w:tcPr>
@@ -279,8 +305,8 @@
               <w:rPr>
                 <w:b/>
                 <w:bCs/>
-                <w:sz w:val="18"/>
-                <w:szCs w:val="18"/>
+                <w:sz w:val="17"/>
+                <w:szCs w:val="17"/>
               </w:rPr>
               <w:t>4. Shortlist draft</w:t>
             </w:r>
@@ -288,28 +314,28 @@
         </w:tc>
         <w:tc>
           <w:tcPr>
-            <w:tcW w:w="7160" w:type="dxa"/>
-            <w:tcMar>
-              <w:top w:w="70" w:type="dxa"/>
-              <w:left w:w="100" w:type="dxa"/>
-              <w:bottom w:w="70" w:type="dxa"/>
-              <w:right w:w="100" w:type="dxa"/>
-            </w:tcMar>
-          </w:tcPr>
-          <w:p>
-            <w:r>
-              <w:rPr>
-                <w:sz w:val="18"/>
-                <w:szCs w:val="18"/>
-              </w:rPr>
-              <w:t xml:space="preserve">The top 15-20 startups are shown with a one-line note explaining why each one </w:t>
-            </w:r>
-            <w:r>
-              <w:rPr>
-                <w:sz w:val="18"/>
-                <w:szCs w:val="18"/>
-              </w:rPr>
-              <w:t>fits, plus a link back to the exact criteria it matched. This lands in a review screen inside the app.</w:t>
+            <w:tcW w:w="8100" w:type="dxa"/>
+            <w:tcMar>
+              <w:top w:w="65" w:type="dxa"/>
+              <w:left w:w="100" w:type="dxa"/>
+              <w:bottom w:w="65" w:type="dxa"/>
+              <w:right w:w="100" w:type="dxa"/>
+            </w:tcMar>
+          </w:tcPr>
+          <w:p>
+            <w:r>
+              <w:rPr>
+                <w:sz w:val="17"/>
+                <w:szCs w:val="17"/>
+              </w:rPr>
+              <w:t>The top 10 to 15 startups are shown, each with its name, one-line description, sector and stage, website link, and one sentence on why it fits, written by a stronger model on</w:t>
+            </w:r>
+            <w:r>
+              <w:rPr>
+                <w:sz w:val="17"/>
+                <w:szCs w:val="17"/>
+              </w:rPr>
+              <w:t>ce the shortlist is set. Where startups fit equally well, the one shortlisted less often recently is preferred, so the same well-known names don't win every time. The list is saved as a link the requester can reopen later.</w:t>
             </w:r>
           </w:p>
         </w:tc>
@@ -323,12 +349,12 @@
         </w:tblPrEx>
         <w:tc>
           <w:tcPr>
-            <w:tcW w:w="2200" w:type="dxa"/>
+            <w:tcW w:w="2000" w:type="dxa"/>
             <w:shd w:val="clear" w:color="auto" w:fill="F3F4F6"/>
             <w:tcMar>
-              <w:top w:w="70" w:type="dxa"/>
-              <w:left w:w="100" w:type="dxa"/>
-              <w:bottom w:w="70" w:type="dxa"/>
+              <w:top w:w="65" w:type="dxa"/>
+              <w:left w:w="100" w:type="dxa"/>
+              <w:bottom w:w="65" w:type="dxa"/>
               <w:right w:w="100" w:type="dxa"/>
             </w:tcMar>
           </w:tcPr>
@@ -337,8 +363,8 @@
               <w:rPr>
                 <w:b/>
                 <w:bCs/>
-                <w:sz w:val="18"/>
-                <w:szCs w:val="18"/>
+                <w:sz w:val="17"/>
+                <w:szCs w:val="17"/>
               </w:rPr>
               <w:t>5. Human review</w:t>
             </w:r>
@@ -346,21 +372,21 @@
         </w:tc>
         <w:tc>
           <w:tcPr>
-            <w:tcW w:w="7160" w:type="dxa"/>
-            <w:tcMar>
-              <w:top w:w="70" w:type="dxa"/>
-              <w:left w:w="100" w:type="dxa"/>
-              <w:bottom w:w="70" w:type="dxa"/>
-              <w:right w:w="100" w:type="dxa"/>
-            </w:tcMar>
-          </w:tcPr>
-          <w:p>
-            <w:r>
-              <w:rPr>
-                <w:sz w:val="18"/>
-                <w:szCs w:val="18"/>
-              </w:rPr>
-              <w:t>A team member checks the list, edits it if needed, and approves it. Nothing is sent to a requester without this step.</w:t>
+            <w:tcW w:w="8100" w:type="dxa"/>
+            <w:tcMar>
+              <w:top w:w="65" w:type="dxa"/>
+              <w:left w:w="100" w:type="dxa"/>
+              <w:bottom w:w="65" w:type="dxa"/>
+              <w:right w:w="100" w:type="dxa"/>
+            </w:tcMar>
+          </w:tcPr>
+          <w:p>
+            <w:r>
+              <w:rPr>
+                <w:sz w:val="17"/>
+                <w:szCs w:val="17"/>
+              </w:rPr>
+              <w:t>A team member checks the list, edits it if needed, and approves it, either inside the app or directly from the notification email so nothing new has to be learned. Nothing is sent to a requester without this step.</w:t>
             </w:r>
           </w:p>
         </w:tc>
@@ -374,12 +400,12 @@
         </w:tblPrEx>
         <w:tc>
           <w:tcPr>
-            <w:tcW w:w="2200" w:type="dxa"/>
+            <w:tcW w:w="2000" w:type="dxa"/>
             <w:shd w:val="clear" w:color="auto" w:fill="F3F4F6"/>
             <w:tcMar>
-              <w:top w:w="70" w:type="dxa"/>
-              <w:left w:w="100" w:type="dxa"/>
-              <w:bottom w:w="70" w:type="dxa"/>
+              <w:top w:w="65" w:type="dxa"/>
+              <w:left w:w="100" w:type="dxa"/>
+              <w:bottom w:w="65" w:type="dxa"/>
               <w:right w:w="100" w:type="dxa"/>
             </w:tcMar>
           </w:tcPr>
@@ -388,8 +414,8 @@
               <w:rPr>
                 <w:b/>
                 <w:bCs/>
-                <w:sz w:val="18"/>
-                <w:szCs w:val="18"/>
+                <w:sz w:val="17"/>
+                <w:szCs w:val="17"/>
               </w:rPr>
               <w:t>6. Send and log</w:t>
             </w:r>
@@ -397,28 +423,28 @@
         </w:tc>
         <w:tc>
           <w:tcPr>
-            <w:tcW w:w="7160" w:type="dxa"/>
-            <w:tcMar>
-              <w:top w:w="70" w:type="dxa"/>
-              <w:left w:w="100" w:type="dxa"/>
-              <w:bottom w:w="70" w:type="dxa"/>
-              <w:right w:w="100" w:type="dxa"/>
-            </w:tcMar>
-          </w:tcPr>
-          <w:p>
-            <w:r>
-              <w:rPr>
-                <w:sz w:val="18"/>
-                <w:szCs w:val="18"/>
-              </w:rPr>
-              <w:t>The approved shortlist goes out through the team's existing mailbox. A bounce reopens the request. Every request, shortli</w:t>
-            </w:r>
-            <w:r>
-              <w:rPr>
-                <w:sz w:val="18"/>
-                <w:szCs w:val="18"/>
-              </w:rPr>
-              <w:t>st, and edit is logged for future reference.</w:t>
+            <w:tcW w:w="8100" w:type="dxa"/>
+            <w:tcMar>
+              <w:top w:w="65" w:type="dxa"/>
+              <w:left w:w="100" w:type="dxa"/>
+              <w:bottom w:w="65" w:type="dxa"/>
+              <w:right w:w="100" w:type="dxa"/>
+            </w:tcMar>
+          </w:tcPr>
+          <w:p>
+            <w:r>
+              <w:rPr>
+                <w:sz w:val="17"/>
+                <w:szCs w:val="17"/>
+              </w:rPr>
+              <w:t>The approved shortlist go</w:t>
+            </w:r>
+            <w:r>
+              <w:rPr>
+                <w:sz w:val="17"/>
+                <w:szCs w:val="17"/>
+              </w:rPr>
+              <w:t>es out through the team's existing mailbox. A bounce reopens the request. Every request, shortlist, and edit is logged for future reference.</w:t>
             </w:r>
           </w:p>
         </w:tc>
@@ -426,37 +452,91 @@
     </w:tbl>
     <w:p>
       <w:pPr>
-        <w:spacing w:after="100"/>
-      </w:pPr>
-      <w:r>
-        <w:rPr>
-          <w:sz w:val="6"/>
-          <w:szCs w:val="6"/>
+        <w:spacing w:after="90"/>
+      </w:pPr>
+      <w:r>
+        <w:rPr>
+          <w:sz w:val="5"/>
+          <w:szCs w:val="5"/>
         </w:rPr>
         <w:t xml:space="preserve"> </w:t>
       </w:r>
     </w:p>
     <w:p>
       <w:pPr>
-        <w:spacing w:after="100"/>
-      </w:pPr>
-      <w:r>
-        <w:t>The guiding principle throughout is that a deterministic layer, not an AI model, always decides who is eligible and how they rank. AI is used only where it genuinely helps: reading free text and writing short</w:t>
-      </w:r>
-      <w:r>
-        <w:t xml:space="preserve"> explanations. It never makes the final decision to send something out, and any text pulled from emails or websites is treated purely as information, never as an instruction for the system to follow. The matchmaking tool is built as its own app, separate f</w:t>
-      </w:r>
-      <w:r>
-        <w:t>rom the website's codebase. Running two apps side by side needs more memory than the current server has spare, since even a single build already needs extra swap space, so this plan assumes upgrading the server to 4 vCPUs and 8GB of RAM before both run tog</w:t>
-      </w:r>
-      <w:r>
-        <w:t>ether.</w:t>
+        <w:spacing w:after="90"/>
+      </w:pPr>
+      <w:r>
+        <w:rPr>
+          <w:sz w:val="19"/>
+          <w:szCs w:val="19"/>
+        </w:rPr>
+        <w:t xml:space="preserve">The guiding principle throughout is that a deterministic layer, not an AI model, always decides who is eligible </w:t>
+      </w:r>
+      <w:r>
+        <w:rPr>
+          <w:sz w:val="19"/>
+          <w:szCs w:val="19"/>
+        </w:rPr>
+        <w:t>and how they rank; AI is used only to read free text and write short explanations, never to make the final decision to send something out, and any text pulled from emails or websites is treated purely as information, never as an instruction to follow. It r</w:t>
+      </w:r>
+      <w:r>
+        <w:rPr>
+          <w:sz w:val="19"/>
+          <w:szCs w:val="19"/>
+        </w:rPr>
+        <w:t>uns as its own service on the existing Hetzner server, which needs a small upgrade to 4 vCPU and 8GB so the two apps never compete for memory.</w:t>
       </w:r>
     </w:p>
     <w:p>
       <w:pPr>
+        <w:spacing w:after="90"/>
+      </w:pPr>
+      <w:r>
+        <w:rPr>
+          <w:sz w:val="19"/>
+          <w:szCs w:val="19"/>
+        </w:rPr>
+        <w:t xml:space="preserve">The 600-row sheet becomes a proper table with a fixed set of fields: name, website, one-line description, sector </w:t>
+      </w:r>
+      <w:r>
+        <w:rPr>
+          <w:sz w:val="19"/>
+          <w:szCs w:val="19"/>
+        </w:rPr>
+        <w:t>tags, stage, founded year, team size, funding raised, geography, contact, and last-confirmed date. Sector and stage move to controlled lists with synonyms mapped once, so “fintech” and “finanšu tehnoloģijas” resolve to the same tag, because free text in th</w:t>
+      </w:r>
+      <w:r>
+        <w:rPr>
+          <w:sz w:val="19"/>
+          <w:szCs w:val="19"/>
+        </w:rPr>
+        <w:t>ose two columns is what makes today's spreadsheet search miss good matches. Anything the import can't map is flagged for a person rather than guessed.</w:t>
+      </w:r>
+    </w:p>
+    <w:p>
+      <w:pPr>
+        <w:spacing w:after="90"/>
+      </w:pPr>
+      <w:r>
+        <w:rPr>
+          <w:sz w:val="19"/>
+          <w:szCs w:val="19"/>
+        </w:rPr>
+        <w:t>Startups confirm once that they can be shared with investors and event organisers, and that consent is st</w:t>
+      </w:r>
+      <w:r>
+        <w:rPr>
+          <w:sz w:val="19"/>
+          <w:szCs w:val="19"/>
+        </w:rPr>
+        <w:t>ored with a date. A startup can opt out of specific request types, for example investor deal flow, and where a request is for an introduction rather than a list, the startup is asked before its contact details go out.</w:t>
+      </w:r>
+    </w:p>
+    <w:p>
+      <w:pPr>
         <w:pStyle w:val="Heading2"/>
-        <w:spacing w:before="200" w:after="70"/>
+        <w:spacing w:before="180" w:after="60"/>
       </w:pPr>
       <w:r>
         <w:rPr>
@@ -469,7 +549,7 @@
     </w:p>
     <w:tbl>
       <w:tblPr>
-        <w:tblW w:w="9360" w:type="dxa"/>
+        <w:tblW w:w="10100" w:type="dxa"/>
         <w:tblBorders>
           <w:top w:val="single" w:sz="4" w:space="0" w:color="auto"/>
           <w:left w:val="single" w:sz="4" w:space="0" w:color="auto"/>
@@ -482,12 +562,12 @@
           <w:left w:w="10" w:type="dxa"/>
           <w:right w:w="10" w:type="dxa"/>
         </w:tblCellMar>
-        <w:tblLook w:val="04A0" w:firstRow="1" w:lastRow="0" w:firstColumn="1" w:lastColumn="0" w:noHBand="0" w:noVBand="1"/>
+        <w:tblLook w:val="0000" w:firstRow="0" w:lastRow="0" w:firstColumn="0" w:lastColumn="0" w:noHBand="0" w:noVBand="0"/>
       </w:tblPr>
       <w:tblGrid>
-        <w:gridCol w:w="2700"/>
-        <w:gridCol w:w="3860"/>
-        <w:gridCol w:w="2800"/>
+        <w:gridCol w:w="2600"/>
+        <w:gridCol w:w="4500"/>
+        <w:gridCol w:w="3000"/>
       </w:tblGrid>
       <w:tr>
         <w:tblPrEx>
@@ -498,12 +578,12 @@
         </w:tblPrEx>
         <w:tc>
           <w:tcPr>
-            <w:tcW w:w="2700" w:type="dxa"/>
+            <w:tcW w:w="2600" w:type="dxa"/>
             <w:shd w:val="clear" w:color="auto" w:fill="E5E7EB"/>
             <w:tcMar>
-              <w:top w:w="70" w:type="dxa"/>
-              <w:left w:w="100" w:type="dxa"/>
-              <w:bottom w:w="70" w:type="dxa"/>
+              <w:top w:w="65" w:type="dxa"/>
+              <w:left w:w="100" w:type="dxa"/>
+              <w:bottom w:w="65" w:type="dxa"/>
               <w:right w:w="100" w:type="dxa"/>
             </w:tcMar>
           </w:tcPr>
@@ -512,8 +592,8 @@
               <w:rPr>
                 <w:b/>
                 <w:bCs/>
-                <w:sz w:val="18"/>
-                <w:szCs w:val="18"/>
+                <w:sz w:val="17"/>
+                <w:szCs w:val="17"/>
               </w:rPr>
               <w:t>Item</w:t>
             </w:r>
@@ -521,12 +601,12 @@
         </w:tc>
         <w:tc>
           <w:tcPr>
-            <w:tcW w:w="3860" w:type="dxa"/>
+            <w:tcW w:w="4500" w:type="dxa"/>
             <w:shd w:val="clear" w:color="auto" w:fill="E5E7EB"/>
             <w:tcMar>
-              <w:top w:w="70" w:type="dxa"/>
-              <w:left w:w="100" w:type="dxa"/>
-              <w:bottom w:w="70" w:type="dxa"/>
+              <w:top w:w="65" w:type="dxa"/>
+              <w:left w:w="100" w:type="dxa"/>
+              <w:bottom w:w="65" w:type="dxa"/>
               <w:right w:w="100" w:type="dxa"/>
             </w:tcMar>
           </w:tcPr>
@@ -535,8 +615,8 @@
               <w:rPr>
                 <w:b/>
                 <w:bCs/>
-                <w:sz w:val="18"/>
-                <w:szCs w:val="18"/>
+                <w:sz w:val="17"/>
+                <w:szCs w:val="17"/>
               </w:rPr>
               <w:t>Tool</w:t>
             </w:r>
@@ -544,12 +624,12 @@
         </w:tc>
         <w:tc>
           <w:tcPr>
-            <w:tcW w:w="2800" w:type="dxa"/>
+            <w:tcW w:w="3000" w:type="dxa"/>
             <w:shd w:val="clear" w:color="auto" w:fill="E5E7EB"/>
             <w:tcMar>
-              <w:top w:w="70" w:type="dxa"/>
-              <w:left w:w="100" w:type="dxa"/>
-              <w:bottom w:w="70" w:type="dxa"/>
+              <w:top w:w="65" w:type="dxa"/>
+              <w:left w:w="100" w:type="dxa"/>
+              <w:bottom w:w="65" w:type="dxa"/>
               <w:right w:w="100" w:type="dxa"/>
             </w:tcMar>
           </w:tcPr>
@@ -558,8 +638,8 @@
               <w:rPr>
                 <w:b/>
                 <w:bCs/>
-                <w:sz w:val="18"/>
-                <w:szCs w:val="18"/>
+                <w:sz w:val="17"/>
+                <w:szCs w:val="17"/>
               </w:rPr>
               <w:t>Est. monthly cost</w:t>
             </w:r>
@@ -575,19 +655,19 @@
         </w:tblPrEx>
         <w:tc>
           <w:tcPr>
-            <w:tcW w:w="2700" w:type="dxa"/>
-            <w:tcMar>
-              <w:top w:w="70" w:type="dxa"/>
-              <w:left w:w="100" w:type="dxa"/>
-              <w:bottom w:w="70" w:type="dxa"/>
-              <w:right w:w="100" w:type="dxa"/>
-            </w:tcMar>
-          </w:tcPr>
-          <w:p>
-            <w:r>
-              <w:rPr>
-                <w:sz w:val="18"/>
-                <w:szCs w:val="18"/>
+            <w:tcW w:w="2600" w:type="dxa"/>
+            <w:tcMar>
+              <w:top w:w="65" w:type="dxa"/>
+              <w:left w:w="100" w:type="dxa"/>
+              <w:bottom w:w="65" w:type="dxa"/>
+              <w:right w:w="100" w:type="dxa"/>
+            </w:tcMar>
+          </w:tcPr>
+          <w:p>
+            <w:r>
+              <w:rPr>
+                <w:sz w:val="17"/>
+                <w:szCs w:val="17"/>
               </w:rPr>
               <w:t>Hosting (both apps)</w:t>
             </w:r>
@@ -595,39 +675,39 @@
         </w:tc>
         <w:tc>
           <w:tcPr>
-            <w:tcW w:w="3860" w:type="dxa"/>
-            <w:tcMar>
-              <w:top w:w="70" w:type="dxa"/>
-              <w:left w:w="100" w:type="dxa"/>
-              <w:bottom w:w="70" w:type="dxa"/>
-              <w:right w:w="100" w:type="dxa"/>
-            </w:tcMar>
-          </w:tcPr>
-          <w:p>
-            <w:r>
-              <w:rPr>
-                <w:sz w:val="18"/>
-                <w:szCs w:val="18"/>
-              </w:rPr>
-              <w:t>Hetzner VPS, upgraded to 4 vCPU / 8GB so the website and the matchmaking app can run as two independent services without competing for memory during builds</w:t>
-            </w:r>
-          </w:p>
-        </w:tc>
-        <w:tc>
-          <w:tcPr>
-            <w:tcW w:w="2800" w:type="dxa"/>
-            <w:tcMar>
-              <w:top w:w="70" w:type="dxa"/>
-              <w:left w:w="100" w:type="dxa"/>
-              <w:bottom w:w="70" w:type="dxa"/>
-              <w:right w:w="100" w:type="dxa"/>
-            </w:tcMar>
-          </w:tcPr>
-          <w:p>
-            <w:r>
-              <w:rPr>
-                <w:sz w:val="18"/>
-                <w:szCs w:val="18"/>
+            <w:tcW w:w="4500" w:type="dxa"/>
+            <w:tcMar>
+              <w:top w:w="65" w:type="dxa"/>
+              <w:left w:w="100" w:type="dxa"/>
+              <w:bottom w:w="65" w:type="dxa"/>
+              <w:right w:w="100" w:type="dxa"/>
+            </w:tcMar>
+          </w:tcPr>
+          <w:p>
+            <w:r>
+              <w:rPr>
+                <w:sz w:val="17"/>
+                <w:szCs w:val="17"/>
+              </w:rPr>
+              <w:t>Hetzner VPS, upgraded to 4 vCPU / 8GB so the website and the matchmaking app run as two independent services</w:t>
+            </w:r>
+          </w:p>
+        </w:tc>
+        <w:tc>
+          <w:tcPr>
+            <w:tcW w:w="3000" w:type="dxa"/>
+            <w:tcMar>
+              <w:top w:w="65" w:type="dxa"/>
+              <w:left w:w="100" w:type="dxa"/>
+              <w:bottom w:w="65" w:type="dxa"/>
+              <w:right w:w="100" w:type="dxa"/>
+            </w:tcMar>
+          </w:tcPr>
+          <w:p>
+            <w:r>
+              <w:rPr>
+                <w:sz w:val="17"/>
+                <w:szCs w:val="17"/>
               </w:rPr>
               <w:t>About €7.70 (up from about €4.35 today)</w:t>
             </w:r>
@@ -643,59 +723,59 @@
         </w:tblPrEx>
         <w:tc>
           <w:tcPr>
-            <w:tcW w:w="2700" w:type="dxa"/>
-            <w:tcMar>
-              <w:top w:w="70" w:type="dxa"/>
-              <w:left w:w="100" w:type="dxa"/>
-              <w:bottom w:w="70" w:type="dxa"/>
-              <w:right w:w="100" w:type="dxa"/>
-            </w:tcMar>
-          </w:tcPr>
-          <w:p>
-            <w:r>
-              <w:rPr>
-                <w:sz w:val="18"/>
-                <w:szCs w:val="18"/>
-              </w:rPr>
-              <w:t>Startup and request database</w:t>
-            </w:r>
-          </w:p>
-        </w:tc>
-        <w:tc>
-          <w:tcPr>
-            <w:tcW w:w="3860" w:type="dxa"/>
-            <w:tcMar>
-              <w:top w:w="70" w:type="dxa"/>
-              <w:left w:w="100" w:type="dxa"/>
-              <w:bottom w:w="70" w:type="dxa"/>
-              <w:right w:w="100" w:type="dxa"/>
-            </w:tcMar>
-          </w:tcPr>
-          <w:p>
-            <w:r>
-              <w:rPr>
-                <w:sz w:val="18"/>
-                <w:szCs w:val="18"/>
-              </w:rPr>
-              <w:t>Postgres on the same VPS, in its own database</w:t>
-            </w:r>
-          </w:p>
-        </w:tc>
-        <w:tc>
-          <w:tcPr>
-            <w:tcW w:w="2800" w:type="dxa"/>
-            <w:tcMar>
-              <w:top w:w="70" w:type="dxa"/>
-              <w:left w:w="100" w:type="dxa"/>
-              <w:bottom w:w="70" w:type="dxa"/>
-              <w:right w:w="100" w:type="dxa"/>
-            </w:tcMar>
-          </w:tcPr>
-          <w:p>
-            <w:r>
-              <w:rPr>
-                <w:sz w:val="18"/>
-                <w:szCs w:val="18"/>
+            <w:tcW w:w="2600" w:type="dxa"/>
+            <w:tcMar>
+              <w:top w:w="65" w:type="dxa"/>
+              <w:left w:w="100" w:type="dxa"/>
+              <w:bottom w:w="65" w:type="dxa"/>
+              <w:right w:w="100" w:type="dxa"/>
+            </w:tcMar>
+          </w:tcPr>
+          <w:p>
+            <w:r>
+              <w:rPr>
+                <w:sz w:val="17"/>
+                <w:szCs w:val="17"/>
+              </w:rPr>
+              <w:t>Database, email, and matching logic</w:t>
+            </w:r>
+          </w:p>
+        </w:tc>
+        <w:tc>
+          <w:tcPr>
+            <w:tcW w:w="4500" w:type="dxa"/>
+            <w:tcMar>
+              <w:top w:w="65" w:type="dxa"/>
+              <w:left w:w="100" w:type="dxa"/>
+              <w:bottom w:w="65" w:type="dxa"/>
+              <w:right w:w="100" w:type="dxa"/>
+            </w:tcMar>
+          </w:tcPr>
+          <w:p>
+            <w:r>
+              <w:rPr>
+                <w:sz w:val="17"/>
+                <w:szCs w:val="17"/>
+              </w:rPr>
+              <w:t>All reuse infrastructure already in place: Postgres, the existing mailbox, and rules that run inside the app</w:t>
+            </w:r>
+          </w:p>
+        </w:tc>
+        <w:tc>
+          <w:tcPr>
+            <w:tcW w:w="3000" w:type="dxa"/>
+            <w:tcMar>
+              <w:top w:w="65" w:type="dxa"/>
+              <w:left w:w="100" w:type="dxa"/>
+              <w:bottom w:w="65" w:type="dxa"/>
+              <w:right w:w="100" w:type="dxa"/>
+            </w:tcMar>
+          </w:tcPr>
+          <w:p>
+            <w:r>
+              <w:rPr>
+                <w:sz w:val="17"/>
+                <w:szCs w:val="17"/>
               </w:rPr>
               <w:t>€0 new</w:t>
             </w:r>
@@ -711,61 +791,68 @@
         </w:tblPrEx>
         <w:tc>
           <w:tcPr>
-            <w:tcW w:w="2700" w:type="dxa"/>
-            <w:tcMar>
-              <w:top w:w="70" w:type="dxa"/>
-              <w:left w:w="100" w:type="dxa"/>
-              <w:bottom w:w="70" w:type="dxa"/>
-              <w:right w:w="100" w:type="dxa"/>
-            </w:tcMar>
-          </w:tcPr>
-          <w:p>
-            <w:r>
-              <w:rPr>
-                <w:sz w:val="18"/>
-                <w:szCs w:val="18"/>
-              </w:rPr>
-              <w:t>Inbound email</w:t>
-            </w:r>
-          </w:p>
-        </w:tc>
-        <w:tc>
-          <w:tcPr>
-            <w:tcW w:w="3860" w:type="dxa"/>
-            <w:tcMar>
-              <w:top w:w="70" w:type="dxa"/>
-              <w:left w:w="100" w:type="dxa"/>
-              <w:bottom w:w="70" w:type="dxa"/>
-              <w:right w:w="100" w:type="dxa"/>
-            </w:tcMar>
-          </w:tcPr>
-          <w:p>
-            <w:r>
-              <w:rPr>
-                <w:sz w:val="18"/>
-                <w:szCs w:val="18"/>
-              </w:rPr>
-              <w:t>Existing team mailbox, checked by a small script</w:t>
-            </w:r>
-          </w:p>
-        </w:tc>
-        <w:tc>
-          <w:tcPr>
-            <w:tcW w:w="2800" w:type="dxa"/>
-            <w:tcMar>
-              <w:top w:w="70" w:type="dxa"/>
-              <w:left w:w="100" w:type="dxa"/>
-              <w:bottom w:w="70" w:type="dxa"/>
-              <w:right w:w="100" w:type="dxa"/>
-            </w:tcMar>
-          </w:tcPr>
-          <w:p>
-            <w:r>
-              <w:rPr>
-                <w:sz w:val="18"/>
-                <w:szCs w:val="18"/>
-              </w:rPr>
-              <w:t>€0 new</w:t>
+            <w:tcW w:w="2600" w:type="dxa"/>
+            <w:tcMar>
+              <w:top w:w="65" w:type="dxa"/>
+              <w:left w:w="100" w:type="dxa"/>
+              <w:bottom w:w="65" w:type="dxa"/>
+              <w:right w:w="100" w:type="dxa"/>
+            </w:tcMar>
+          </w:tcPr>
+          <w:p>
+            <w:r>
+              <w:rPr>
+                <w:sz w:val="17"/>
+                <w:szCs w:val="17"/>
+              </w:rPr>
+              <w:t>AI (reading requests, writing rationale)</w:t>
+            </w:r>
+          </w:p>
+        </w:tc>
+        <w:tc>
+          <w:tcPr>
+            <w:tcW w:w="4500" w:type="dxa"/>
+            <w:tcMar>
+              <w:top w:w="65" w:type="dxa"/>
+              <w:left w:w="100" w:type="dxa"/>
+              <w:bottom w:w="65" w:type="dxa"/>
+              <w:right w:w="100" w:type="dxa"/>
+            </w:tcMar>
+          </w:tcPr>
+          <w:p>
+            <w:r>
+              <w:rPr>
+                <w:sz w:val="17"/>
+                <w:szCs w:val="17"/>
+              </w:rPr>
+              <w:t>Claude: a fast model for reading and structuring each request, a stronger model for writing the sh</w:t>
+            </w:r>
+            <w:r>
+              <w:rPr>
+                <w:sz w:val="17"/>
+                <w:szCs w:val="17"/>
+              </w:rPr>
+              <w:t>ortlist rationale, roughly 50 requests a month</w:t>
+            </w:r>
+          </w:p>
+        </w:tc>
+        <w:tc>
+          <w:tcPr>
+            <w:tcW w:w="3000" w:type="dxa"/>
+            <w:tcMar>
+              <w:top w:w="65" w:type="dxa"/>
+              <w:left w:w="100" w:type="dxa"/>
+              <w:bottom w:w="65" w:type="dxa"/>
+              <w:right w:w="100" w:type="dxa"/>
+            </w:tcMar>
+          </w:tcPr>
+          <w:p>
+            <w:r>
+              <w:rPr>
+                <w:sz w:val="17"/>
+                <w:szCs w:val="17"/>
+              </w:rPr>
+              <w:t>€10 to €25</w:t>
             </w:r>
           </w:p>
         </w:tc>
@@ -779,222 +866,11 @@
         </w:tblPrEx>
         <w:tc>
           <w:tcPr>
-            <w:tcW w:w="2700" w:type="dxa"/>
-            <w:tcMar>
-              <w:top w:w="70" w:type="dxa"/>
-              <w:left w:w="100" w:type="dxa"/>
-              <w:bottom w:w="70" w:type="dxa"/>
-              <w:right w:w="100" w:type="dxa"/>
-            </w:tcMar>
-          </w:tcPr>
-          <w:p>
-            <w:r>
-              <w:rPr>
-                <w:sz w:val="18"/>
-                <w:szCs w:val="18"/>
-              </w:rPr>
-              <w:t>Outbound email</w:t>
-            </w:r>
-          </w:p>
-        </w:tc>
-        <w:tc>
-          <w:tcPr>
-            <w:tcW w:w="3860" w:type="dxa"/>
-            <w:tcMar>
-              <w:top w:w="70" w:type="dxa"/>
-              <w:left w:w="100" w:type="dxa"/>
-              <w:bottom w:w="70" w:type="dxa"/>
-              <w:right w:w="100" w:type="dxa"/>
-            </w:tcMar>
-          </w:tcPr>
-          <w:p>
-            <w:r>
-              <w:rPr>
-                <w:sz w:val="18"/>
-                <w:szCs w:val="18"/>
-              </w:rPr>
-              <w:t>Existing email account already used by the site</w:t>
-            </w:r>
-          </w:p>
-        </w:tc>
-        <w:tc>
-          <w:tcPr>
-            <w:tcW w:w="2800" w:type="dxa"/>
-            <w:tcMar>
-              <w:top w:w="70" w:type="dxa"/>
-              <w:left w:w="100" w:type="dxa"/>
-              <w:bottom w:w="70" w:type="dxa"/>
-              <w:right w:w="100" w:type="dxa"/>
-            </w:tcMar>
-          </w:tcPr>
-          <w:p>
-            <w:r>
-              <w:rPr>
-                <w:sz w:val="18"/>
-                <w:szCs w:val="18"/>
-              </w:rPr>
-              <w:t>€0 new</w:t>
-            </w:r>
-          </w:p>
-        </w:tc>
-      </w:tr>
-      <w:tr>
-        <w:tblPrEx>
-          <w:tblCellMar>
-            <w:top w:w="0" w:type="dxa"/>
-            <w:bottom w:w="0" w:type="dxa"/>
-          </w:tblCellMar>
-        </w:tblPrEx>
-        <w:tc>
-          <w:tcPr>
-            <w:tcW w:w="2700" w:type="dxa"/>
-            <w:tcMar>
-              <w:top w:w="70" w:type="dxa"/>
-              <w:left w:w="100" w:type="dxa"/>
-              <w:bottom w:w="70" w:type="dxa"/>
-              <w:right w:w="100" w:type="dxa"/>
-            </w:tcMar>
-          </w:tcPr>
-          <w:p>
-            <w:r>
-              <w:rPr>
-                <w:sz w:val="18"/>
-                <w:szCs w:val="18"/>
-              </w:rPr>
-              <w:t>Matching logic (filters and scoring)</w:t>
-            </w:r>
-          </w:p>
-        </w:tc>
-        <w:tc>
-          <w:tcPr>
-            <w:tcW w:w="3860" w:type="dxa"/>
-            <w:tcMar>
-              <w:top w:w="70" w:type="dxa"/>
-              <w:left w:w="100" w:type="dxa"/>
-              <w:bottom w:w="70" w:type="dxa"/>
-              <w:right w:w="100" w:type="dxa"/>
-            </w:tcMar>
-          </w:tcPr>
-          <w:p>
-            <w:r>
-              <w:rPr>
-                <w:sz w:val="18"/>
-                <w:szCs w:val="18"/>
-              </w:rPr>
-              <w:t>Runs inside the matchma</w:t>
-            </w:r>
-            <w:r>
-              <w:rPr>
-                <w:sz w:val="18"/>
-                <w:szCs w:val="18"/>
-              </w:rPr>
-              <w:t>king app, no external service</w:t>
-            </w:r>
-          </w:p>
-        </w:tc>
-        <w:tc>
-          <w:tcPr>
-            <w:tcW w:w="2800" w:type="dxa"/>
-            <w:tcMar>
-              <w:top w:w="70" w:type="dxa"/>
-              <w:left w:w="100" w:type="dxa"/>
-              <w:bottom w:w="70" w:type="dxa"/>
-              <w:right w:w="100" w:type="dxa"/>
-            </w:tcMar>
-          </w:tcPr>
-          <w:p>
-            <w:r>
-              <w:rPr>
-                <w:sz w:val="18"/>
-                <w:szCs w:val="18"/>
-              </w:rPr>
-              <w:t>€0</w:t>
-            </w:r>
-          </w:p>
-        </w:tc>
-      </w:tr>
-      <w:tr>
-        <w:tblPrEx>
-          <w:tblCellMar>
-            <w:top w:w="0" w:type="dxa"/>
-            <w:bottom w:w="0" w:type="dxa"/>
-          </w:tblCellMar>
-        </w:tblPrEx>
-        <w:tc>
-          <w:tcPr>
-            <w:tcW w:w="2700" w:type="dxa"/>
-            <w:tcMar>
-              <w:top w:w="70" w:type="dxa"/>
-              <w:left w:w="100" w:type="dxa"/>
-              <w:bottom w:w="70" w:type="dxa"/>
-              <w:right w:w="100" w:type="dxa"/>
-            </w:tcMar>
-          </w:tcPr>
-          <w:p>
-            <w:r>
-              <w:rPr>
-                <w:sz w:val="18"/>
-                <w:szCs w:val="18"/>
-              </w:rPr>
-              <w:t>AI (reading requests, writing rationale)</w:t>
-            </w:r>
-          </w:p>
-        </w:tc>
-        <w:tc>
-          <w:tcPr>
-            <w:tcW w:w="3860" w:type="dxa"/>
-            <w:tcMar>
-              <w:top w:w="70" w:type="dxa"/>
-              <w:left w:w="100" w:type="dxa"/>
-              <w:bottom w:w="70" w:type="dxa"/>
-              <w:right w:w="100" w:type="dxa"/>
-            </w:tcMar>
-          </w:tcPr>
-          <w:p>
-            <w:r>
-              <w:rPr>
-                <w:sz w:val="18"/>
-                <w:szCs w:val="18"/>
-              </w:rPr>
-              <w:t>Claude API, pay-per-use, roughly 50 requests a month</w:t>
-            </w:r>
-          </w:p>
-        </w:tc>
-        <w:tc>
-          <w:tcPr>
-            <w:tcW w:w="2800" w:type="dxa"/>
-            <w:tcMar>
-              <w:top w:w="70" w:type="dxa"/>
-              <w:left w:w="100" w:type="dxa"/>
-              <w:bottom w:w="70" w:type="dxa"/>
-              <w:right w:w="100" w:type="dxa"/>
-            </w:tcMar>
-          </w:tcPr>
-          <w:p>
-            <w:r>
-              <w:rPr>
-                <w:sz w:val="18"/>
-                <w:szCs w:val="18"/>
-              </w:rPr>
-              <w:t>€10 to €25</w:t>
-            </w:r>
-          </w:p>
-        </w:tc>
-      </w:tr>
-      <w:tr>
-        <w:tblPrEx>
-          <w:tblCellMar>
-            <w:top w:w="0" w:type="dxa"/>
-            <w:bottom w:w="0" w:type="dxa"/>
-          </w:tblCellMar>
-        </w:tblPrEx>
-        <w:tc>
-          <w:tcPr>
-            <w:tcW w:w="2700" w:type="dxa"/>
-            <w:tcMar>
-              <w:top w:w="70" w:type="dxa"/>
-              <w:left w:w="100" w:type="dxa"/>
-              <w:bottom w:w="70" w:type="dxa"/>
+            <w:tcW w:w="2600" w:type="dxa"/>
+            <w:tcMar>
+              <w:top w:w="65" w:type="dxa"/>
+              <w:left w:w="100" w:type="dxa"/>
+              <w:bottom w:w="65" w:type="dxa"/>
               <w:right w:w="100" w:type="dxa"/>
             </w:tcMar>
           </w:tcPr>
@@ -1003,8 +879,8 @@
               <w:rPr>
                 <w:b/>
                 <w:bCs/>
-                <w:sz w:val="18"/>
-                <w:szCs w:val="18"/>
+                <w:sz w:val="17"/>
+                <w:szCs w:val="17"/>
               </w:rPr>
               <w:t>Total new cost</w:t>
             </w:r>
@@ -1012,11 +888,11 @@
         </w:tc>
         <w:tc>
           <w:tcPr>
-            <w:tcW w:w="3860" w:type="dxa"/>
-            <w:tcMar>
-              <w:top w:w="70" w:type="dxa"/>
-              <w:left w:w="100" w:type="dxa"/>
-              <w:bottom w:w="70" w:type="dxa"/>
+            <w:tcW w:w="4500" w:type="dxa"/>
+            <w:tcMar>
+              <w:top w:w="65" w:type="dxa"/>
+              <w:left w:w="100" w:type="dxa"/>
+              <w:bottom w:w="65" w:type="dxa"/>
               <w:right w:w="100" w:type="dxa"/>
             </w:tcMar>
           </w:tcPr>
@@ -1024,11 +900,11 @@
         </w:tc>
         <w:tc>
           <w:tcPr>
-            <w:tcW w:w="2800" w:type="dxa"/>
-            <w:tcMar>
-              <w:top w:w="70" w:type="dxa"/>
-              <w:left w:w="100" w:type="dxa"/>
-              <w:bottom w:w="70" w:type="dxa"/>
+            <w:tcW w:w="3000" w:type="dxa"/>
+            <w:tcMar>
+              <w:top w:w="65" w:type="dxa"/>
+              <w:left w:w="100" w:type="dxa"/>
+              <w:bottom w:w="65" w:type="dxa"/>
               <w:right w:w="100" w:type="dxa"/>
             </w:tcMar>
           </w:tcPr>
@@ -1037,8 +913,8 @@
               <w:rPr>
                 <w:b/>
                 <w:bCs/>
-                <w:sz w:val="18"/>
-                <w:szCs w:val="18"/>
+                <w:sz w:val="17"/>
+                <w:szCs w:val="17"/>
               </w:rPr>
               <w:t>roughly €13 to €28 a month</w:t>
             </w:r>
@@ -1048,28 +924,39 @@
     </w:tbl>
     <w:p>
       <w:pPr>
-        <w:spacing w:after="100"/>
-      </w:pPr>
-      <w:r>
-        <w:rPr>
-          <w:sz w:val="6"/>
-          <w:szCs w:val="6"/>
+        <w:spacing w:after="90"/>
+      </w:pPr>
+      <w:r>
+        <w:rPr>
+          <w:sz w:val="5"/>
+          <w:szCs w:val="5"/>
         </w:rPr>
         <w:t xml:space="preserve"> </w:t>
       </w:r>
     </w:p>
     <w:p>
       <w:pPr>
-        <w:spacing w:after="100"/>
-      </w:pPr>
-      <w:r>
-        <w:t>That is a small fraction of the roughly 28 hours a month this process currently costs the team, while keeping everything on infrastructure the team already owns and understands.</w:t>
+        <w:spacing w:after="90"/>
+      </w:pPr>
+      <w:r>
+        <w:rPr>
+          <w:sz w:val="19"/>
+          <w:szCs w:val="19"/>
+        </w:rPr>
+        <w:t>That is a small fraction of the roughly 28 hours a month this process currently costs the team, while keeping everything on infrastructure the team alr</w:t>
+      </w:r>
+      <w:r>
+        <w:rPr>
+          <w:sz w:val="19"/>
+          <w:szCs w:val="19"/>
+        </w:rPr>
+        <w:t>eady owns and understands.</w:t>
       </w:r>
     </w:p>
     <w:p>
       <w:pPr>
         <w:pStyle w:val="Heading2"/>
-        <w:spacing w:before="200" w:after="70"/>
+        <w:spacing w:before="180" w:after="60"/>
       </w:pPr>
       <w:r>
         <w:rPr>
@@ -1087,14 +974,14 @@
           <w:ilvl w:val="0"/>
           <w:numId w:val="2"/>
         </w:numPr>
-        <w:spacing w:after="50"/>
-      </w:pPr>
-      <w:r>
-        <w:lastRenderedPageBreak/>
-        <w:t>A person always revie</w:t>
-      </w:r>
-      <w:r>
-        <w:t>ws the shortlist, and can edit it, before anything is sent. The system never emails a requester on its own.</w:t>
+        <w:spacing w:after="45"/>
+      </w:pPr>
+      <w:r>
+        <w:rPr>
+          <w:sz w:val="19"/>
+          <w:szCs w:val="19"/>
+        </w:rPr>
+        <w:t>A person always reviews the shortlist, and can edit it, before anything is sent. The system never emails a requester on its own.</w:t>
       </w:r>
     </w:p>
     <w:p>
@@ -1104,13 +991,22 @@
           <w:ilvl w:val="0"/>
           <w:numId w:val="2"/>
         </w:numPr>
-        <w:spacing w:after="50"/>
-      </w:pPr>
-      <w:r>
-        <w:t>Before launch, we would test the system against about 20 real past requests, including tricky or no-match cases. Half would be used to tune the scor</w:t>
-      </w:r>
-      <w:r>
-        <w:t>ing; the other half would be kept aside purely to check accuracy. We would track what share of suggested startups are actually suitable, and treat any case where a must-have requirement was ignored as a bug to fix immediately, not just a quality issue.</w:t>
+        <w:spacing w:after="45"/>
+      </w:pPr>
+      <w:r>
+        <w:rPr>
+          <w:sz w:val="19"/>
+          <w:szCs w:val="19"/>
+        </w:rPr>
+        <w:lastRenderedPageBreak/>
+        <w:t>Before launch, we would test the system against about 20 real past requests, including tricky or no-match cases. Half would tun</w:t>
+      </w:r>
+      <w:r>
+        <w:rPr>
+          <w:sz w:val="19"/>
+          <w:szCs w:val="19"/>
+        </w:rPr>
+        <w:t>e the scoring; the other half would be kept aside purely to check accuracy, tracking what share of suggested startups are actually suitable and treating any missed must-have requirement as a bug to fix immediately, not just a quality issue.</w:t>
       </w:r>
     </w:p>
     <w:p>
@@ -1120,13 +1016,21 @@
           <w:ilvl w:val="0"/>
           <w:numId w:val="2"/>
         </w:numPr>
-        <w:spacing w:after="50"/>
-      </w:pPr>
-      <w:r>
-        <w:t xml:space="preserve">If </w:t>
-      </w:r>
-      <w:r>
-        <w:t>the AI cannot confidently work out what a request is actually asking for, it goes to a person for manual triage rather than being guessed at.</w:t>
+        <w:spacing w:after="45"/>
+      </w:pPr>
+      <w:r>
+        <w:rPr>
+          <w:sz w:val="19"/>
+          <w:szCs w:val="19"/>
+        </w:rPr>
+        <w:t>During the firs</w:t>
+      </w:r>
+      <w:r>
+        <w:rPr>
+          <w:sz w:val="19"/>
+          <w:szCs w:val="19"/>
+        </w:rPr>
+        <w:t>t three months, we would check a sample of shortlists every week against what a staff member would have chosen by hand, and track how long each request actually takes, aiming to bring it down from about 7 hours a week to about 2.</w:t>
       </w:r>
     </w:p>
     <w:p>
@@ -1136,19 +1040,27 @@
           <w:ilvl w:val="0"/>
           <w:numId w:val="2"/>
         </w:numPr>
-        <w:spacing w:after="50"/>
-      </w:pPr>
-      <w:r>
-        <w:t xml:space="preserve">During the first three months, we would check a sample of shortlists every week against what a staff member would </w:t>
-      </w:r>
-      <w:r>
-        <w:t>have chosen by hand, and track how long each request actually takes, aiming to bring it down from about 7 hours a week to about 2.</w:t>
+        <w:spacing w:after="45"/>
+      </w:pPr>
+      <w:r>
+        <w:rPr>
+          <w:sz w:val="19"/>
+          <w:szCs w:val="19"/>
+        </w:rPr>
+        <w:t>Alongside time and precisi</w:t>
+      </w:r>
+      <w:r>
+        <w:rPr>
+          <w:sz w:val="19"/>
+          <w:szCs w:val="19"/>
+        </w:rPr>
+        <w:t>on, we would track whether it actually works for the requester: the share of shortlists that lead to a reply or an introduction, and the share of requests answered within 24 hours.</w:t>
       </w:r>
     </w:p>
     <w:p>
       <w:pPr>
         <w:pStyle w:val="Heading2"/>
-        <w:spacing w:before="200" w:after="70"/>
+        <w:spacing w:before="180" w:after="60"/>
       </w:pPr>
       <w:r>
         <w:rPr>
@@ -1166,10 +1078,21 @@
           <w:ilvl w:val="0"/>
           <w:numId w:val="2"/>
         </w:numPr>
-        <w:spacing w:after="50"/>
-      </w:pPr>
-      <w:r>
-        <w:t>Startups get a link every few months to review and update their own listing. Changes go into a review queue rather than appearing live immediately.</w:t>
+        <w:spacing w:after="45"/>
+      </w:pPr>
+      <w:r>
+        <w:rPr>
+          <w:sz w:val="19"/>
+          <w:szCs w:val="19"/>
+        </w:rPr>
+        <w:t>Startups get a link every few months to review</w:t>
+      </w:r>
+      <w:r>
+        <w:rPr>
+          <w:sz w:val="19"/>
+          <w:szCs w:val="19"/>
+        </w:rPr>
+        <w:t xml:space="preserve"> and update their own listing. Changes go into a review queue rather than appearing live immediately.</w:t>
       </w:r>
     </w:p>
     <w:p>
@@ -1179,9 +1102,13 @@
           <w:ilvl w:val="0"/>
           <w:numId w:val="2"/>
         </w:numPr>
-        <w:spacing w:after="50"/>
-      </w:pPr>
-      <w:r>
+        <w:spacing w:after="45"/>
+      </w:pPr>
+      <w:r>
+        <w:rPr>
+          <w:sz w:val="19"/>
+          <w:szCs w:val="19"/>
+        </w:rPr>
         <w:t>Any listing that hasn't been confirmed in 6 months is flagged and ranked lower until someone updates it.</w:t>
       </w:r>
     </w:p>
@@ -1192,19 +1119,51 @@
           <w:ilvl w:val="0"/>
           <w:numId w:val="2"/>
         </w:numPr>
-        <w:spacing w:after="50"/>
-      </w:pPr>
-      <w:r>
-        <w:t>Whe</w:t>
-      </w:r>
-      <w:r>
-        <w:t>never a staff member manually adds or removes a startup from a suggested shortlist, that correction is recorded, so repeated corrections can point to a rule that needs adjusting.</w:t>
+        <w:spacing w:after="45"/>
+      </w:pPr>
+      <w:r>
+        <w:rPr>
+          <w:sz w:val="19"/>
+          <w:szCs w:val="19"/>
+        </w:rPr>
+        <w:t xml:space="preserve">Whenever a staff member manually adds or removes </w:t>
+      </w:r>
+      <w:r>
+        <w:rPr>
+          <w:sz w:val="19"/>
+          <w:szCs w:val="19"/>
+        </w:rPr>
+        <w:t>a startup from a suggested shortlist, that correction is recorded, so repeated corrections can point to a rule that needs adjusting.</w:t>
       </w:r>
     </w:p>
     <w:p>
       <w:pPr>
+        <w:pStyle w:val="ListParagraph"/>
+        <w:numPr>
+          <w:ilvl w:val="0"/>
+          <w:numId w:val="2"/>
+        </w:numPr>
+        <w:spacing w:after="45"/>
+      </w:pPr>
+      <w:r>
+        <w:rPr>
+          <w:sz w:val="19"/>
+          <w:szCs w:val="19"/>
+        </w:rPr>
+        <w:t>A monthly view shows which members have never been shortlisted, so representation gaps can be closed deliberately instead o</w:t>
+      </w:r>
+      <w:r>
+        <w:rPr>
+          <w:sz w:val="19"/>
+          <w:szCs w:val="19"/>
+        </w:rPr>
+        <w:t>f the same names appearing every time.</w:t>
+      </w:r>
+    </w:p>
+    <w:p>
+      <w:pPr>
         <w:pStyle w:val="Heading2"/>
-        <w:spacing w:before="200" w:after="70"/>
+        <w:spacing w:before="180" w:after="60"/>
       </w:pPr>
       <w:r>
         <w:rPr>
@@ -1217,7 +1176,7 @@
     </w:p>
     <w:tbl>
       <w:tblPr>
-        <w:tblW w:w="9360" w:type="dxa"/>
+        <w:tblW w:w="10100" w:type="dxa"/>
         <w:tblBorders>
           <w:top w:val="single" w:sz="4" w:space="0" w:color="auto"/>
           <w:left w:val="single" w:sz="4" w:space="0" w:color="auto"/>
@@ -1230,12 +1189,12 @@
           <w:left w:w="10" w:type="dxa"/>
           <w:right w:w="10" w:type="dxa"/>
         </w:tblCellMar>
-        <w:tblLook w:val="04A0" w:firstRow="1" w:lastRow="0" w:firstColumn="1" w:lastColumn="0" w:noHBand="0" w:noVBand="1"/>
+        <w:tblLook w:val="0000" w:firstRow="0" w:lastRow="0" w:firstColumn="0" w:lastColumn="0" w:noHBand="0" w:noVBand="0"/>
       </w:tblPr>
       <w:tblGrid>
         <w:gridCol w:w="1600"/>
-        <w:gridCol w:w="3880"/>
-        <w:gridCol w:w="3880"/>
+        <w:gridCol w:w="4250"/>
+        <w:gridCol w:w="4250"/>
       </w:tblGrid>
       <w:tr>
         <w:tblPrEx>
@@ -1249,9 +1208,9 @@
             <w:tcW w:w="1600" w:type="dxa"/>
             <w:shd w:val="clear" w:color="auto" w:fill="E5E7EB"/>
             <w:tcMar>
-              <w:top w:w="70" w:type="dxa"/>
-              <w:left w:w="100" w:type="dxa"/>
-              <w:bottom w:w="70" w:type="dxa"/>
+              <w:top w:w="65" w:type="dxa"/>
+              <w:left w:w="100" w:type="dxa"/>
+              <w:bottom w:w="65" w:type="dxa"/>
               <w:right w:w="100" w:type="dxa"/>
             </w:tcMar>
           </w:tcPr>
@@ -1259,12 +1218,12 @@
         </w:tc>
         <w:tc>
           <w:tcPr>
-            <w:tcW w:w="3880" w:type="dxa"/>
+            <w:tcW w:w="4250" w:type="dxa"/>
             <w:shd w:val="clear" w:color="auto" w:fill="E5E7EB"/>
             <w:tcMar>
-              <w:top w:w="70" w:type="dxa"/>
-              <w:left w:w="100" w:type="dxa"/>
-              <w:bottom w:w="70" w:type="dxa"/>
+              <w:top w:w="65" w:type="dxa"/>
+              <w:left w:w="100" w:type="dxa"/>
+              <w:bottom w:w="65" w:type="dxa"/>
               <w:right w:w="100" w:type="dxa"/>
             </w:tcMar>
           </w:tcPr>
@@ -1273,8 +1232,8 @@
               <w:rPr>
                 <w:b/>
                 <w:bCs/>
-                <w:sz w:val="18"/>
-                <w:szCs w:val="18"/>
+                <w:sz w:val="17"/>
+                <w:szCs w:val="17"/>
               </w:rPr>
               <w:t>Week 1</w:t>
             </w:r>
@@ -1282,12 +1241,12 @@
         </w:tc>
         <w:tc>
           <w:tcPr>
-            <w:tcW w:w="3880" w:type="dxa"/>
+            <w:tcW w:w="4250" w:type="dxa"/>
             <w:shd w:val="clear" w:color="auto" w:fill="E5E7EB"/>
             <w:tcMar>
-              <w:top w:w="70" w:type="dxa"/>
-              <w:left w:w="100" w:type="dxa"/>
-              <w:bottom w:w="70" w:type="dxa"/>
+              <w:top w:w="65" w:type="dxa"/>
+              <w:left w:w="100" w:type="dxa"/>
+              <w:bottom w:w="65" w:type="dxa"/>
               <w:right w:w="100" w:type="dxa"/>
             </w:tcMar>
           </w:tcPr>
@@ -1296,8 +1255,8 @@
               <w:rPr>
                 <w:b/>
                 <w:bCs/>
-                <w:sz w:val="18"/>
-                <w:szCs w:val="18"/>
+                <w:sz w:val="17"/>
+                <w:szCs w:val="17"/>
               </w:rPr>
               <w:t>Month 3</w:t>
             </w:r>
@@ -1316,9 +1275,9 @@
             <w:tcW w:w="1600" w:type="dxa"/>
             <w:shd w:val="clear" w:color="auto" w:fill="F3F4F6"/>
             <w:tcMar>
-              <w:top w:w="70" w:type="dxa"/>
-              <w:left w:w="100" w:type="dxa"/>
-              <w:bottom w:w="70" w:type="dxa"/>
+              <w:top w:w="65" w:type="dxa"/>
+              <w:left w:w="100" w:type="dxa"/>
+              <w:bottom w:w="65" w:type="dxa"/>
               <w:right w:w="100" w:type="dxa"/>
             </w:tcMar>
           </w:tcPr>
@@ -1327,8 +1286,8 @@
               <w:rPr>
                 <w:b/>
                 <w:bCs/>
-                <w:sz w:val="18"/>
-                <w:szCs w:val="18"/>
+                <w:sz w:val="17"/>
+                <w:szCs w:val="17"/>
               </w:rPr>
               <w:t>Where it runs</w:t>
             </w:r>
@@ -1336,46 +1295,39 @@
         </w:tc>
         <w:tc>
           <w:tcPr>
-            <w:tcW w:w="3880" w:type="dxa"/>
-            <w:tcMar>
-              <w:top w:w="70" w:type="dxa"/>
-              <w:left w:w="100" w:type="dxa"/>
-              <w:bottom w:w="70" w:type="dxa"/>
-              <w:right w:w="100" w:type="dxa"/>
-            </w:tcMar>
-          </w:tcPr>
-          <w:p>
-            <w:r>
-              <w:rPr>
-                <w:sz w:val="18"/>
-                <w:szCs w:val="18"/>
-              </w:rPr>
-              <w:t>A lightweight</w:t>
-            </w:r>
-            <w:r>
-              <w:rPr>
-                <w:sz w:val="18"/>
-                <w:szCs w:val="18"/>
-              </w:rPr>
-              <w:t xml:space="preserve"> prototype added to the current server, to get something working quickly</w:t>
-            </w:r>
-          </w:p>
-        </w:tc>
-        <w:tc>
-          <w:tcPr>
-            <w:tcW w:w="3880" w:type="dxa"/>
-            <w:tcMar>
-              <w:top w:w="70" w:type="dxa"/>
-              <w:left w:w="100" w:type="dxa"/>
-              <w:bottom w:w="70" w:type="dxa"/>
-              <w:right w:w="100" w:type="dxa"/>
-            </w:tcMar>
-          </w:tcPr>
-          <w:p>
-            <w:r>
-              <w:rPr>
-                <w:sz w:val="18"/>
-                <w:szCs w:val="18"/>
+            <w:tcW w:w="4250" w:type="dxa"/>
+            <w:tcMar>
+              <w:top w:w="65" w:type="dxa"/>
+              <w:left w:w="100" w:type="dxa"/>
+              <w:bottom w:w="65" w:type="dxa"/>
+              <w:right w:w="100" w:type="dxa"/>
+            </w:tcMar>
+          </w:tcPr>
+          <w:p>
+            <w:r>
+              <w:rPr>
+                <w:sz w:val="17"/>
+                <w:szCs w:val="17"/>
+              </w:rPr>
+              <w:t>A lightweight prototype added to the current server, to get something working quickly</w:t>
+            </w:r>
+          </w:p>
+        </w:tc>
+        <w:tc>
+          <w:tcPr>
+            <w:tcW w:w="4250" w:type="dxa"/>
+            <w:tcMar>
+              <w:top w:w="65" w:type="dxa"/>
+              <w:left w:w="100" w:type="dxa"/>
+              <w:bottom w:w="65" w:type="dxa"/>
+              <w:right w:w="100" w:type="dxa"/>
+            </w:tcMar>
+          </w:tcPr>
+          <w:p>
+            <w:r>
+              <w:rPr>
+                <w:sz w:val="17"/>
+                <w:szCs w:val="17"/>
               </w:rPr>
               <w:t>Its own separate app, running on the upgraded server</w:t>
             </w:r>
@@ -1394,9 +1346,9 @@
             <w:tcW w:w="1600" w:type="dxa"/>
             <w:shd w:val="clear" w:color="auto" w:fill="F3F4F6"/>
             <w:tcMar>
-              <w:top w:w="70" w:type="dxa"/>
-              <w:left w:w="100" w:type="dxa"/>
-              <w:bottom w:w="70" w:type="dxa"/>
+              <w:top w:w="65" w:type="dxa"/>
+              <w:left w:w="100" w:type="dxa"/>
+              <w:bottom w:w="65" w:type="dxa"/>
               <w:right w:w="100" w:type="dxa"/>
             </w:tcMar>
           </w:tcPr>
@@ -1405,8 +1357,8 @@
               <w:rPr>
                 <w:b/>
                 <w:bCs/>
-                <w:sz w:val="18"/>
-                <w:szCs w:val="18"/>
+                <w:sz w:val="17"/>
+                <w:szCs w:val="17"/>
               </w:rPr>
               <w:t>Database</w:t>
             </w:r>
@@ -1414,41 +1366,48 @@
         </w:tc>
         <w:tc>
           <w:tcPr>
-            <w:tcW w:w="3880" w:type="dxa"/>
-            <w:tcMar>
-              <w:top w:w="70" w:type="dxa"/>
-              <w:left w:w="100" w:type="dxa"/>
-              <w:bottom w:w="70" w:type="dxa"/>
-              <w:right w:w="100" w:type="dxa"/>
-            </w:tcMar>
-          </w:tcPr>
-          <w:p>
-            <w:r>
-              <w:rPr>
-                <w:sz w:val="18"/>
-                <w:szCs w:val="18"/>
-              </w:rPr>
-              <w:t>The Excel file imported into a proper database table, a few hours of setup</w:t>
-            </w:r>
-          </w:p>
-        </w:tc>
-        <w:tc>
-          <w:tcPr>
-            <w:tcW w:w="3880" w:type="dxa"/>
-            <w:tcMar>
-              <w:top w:w="70" w:type="dxa"/>
-              <w:left w:w="100" w:type="dxa"/>
-              <w:bottom w:w="70" w:type="dxa"/>
-              <w:right w:w="100" w:type="dxa"/>
-            </w:tcMar>
-          </w:tcPr>
-          <w:p>
-            <w:r>
-              <w:rPr>
-                <w:sz w:val="18"/>
-                <w:szCs w:val="18"/>
-              </w:rPr>
-              <w:t>The same data, kept up to date automatically</w:t>
+            <w:tcW w:w="4250" w:type="dxa"/>
+            <w:tcMar>
+              <w:top w:w="65" w:type="dxa"/>
+              <w:left w:w="100" w:type="dxa"/>
+              <w:bottom w:w="65" w:type="dxa"/>
+              <w:right w:w="100" w:type="dxa"/>
+            </w:tcMar>
+          </w:tcPr>
+          <w:p>
+            <w:r>
+              <w:rPr>
+                <w:sz w:val="17"/>
+                <w:szCs w:val="17"/>
+              </w:rPr>
+              <w:t>The Excel file imported into a proper table with fixed fields and controlled sector/stage lists</w:t>
+            </w:r>
+          </w:p>
+        </w:tc>
+        <w:tc>
+          <w:tcPr>
+            <w:tcW w:w="4250" w:type="dxa"/>
+            <w:tcMar>
+              <w:top w:w="65" w:type="dxa"/>
+              <w:left w:w="100" w:type="dxa"/>
+              <w:bottom w:w="65" w:type="dxa"/>
+              <w:right w:w="100" w:type="dxa"/>
+            </w:tcMar>
+          </w:tcPr>
+          <w:p>
+            <w:r>
+              <w:rPr>
+                <w:sz w:val="17"/>
+                <w:szCs w:val="17"/>
+              </w:rPr>
+              <w:t>The same da</w:t>
+            </w:r>
+            <w:r>
+              <w:rPr>
+                <w:sz w:val="17"/>
+                <w:szCs w:val="17"/>
+              </w:rPr>
+              <w:t>ta, kept up to date automatically</w:t>
             </w:r>
           </w:p>
         </w:tc>
@@ -1465,9 +1424,9 @@
             <w:tcW w:w="1600" w:type="dxa"/>
             <w:shd w:val="clear" w:color="auto" w:fill="F3F4F6"/>
             <w:tcMar>
-              <w:top w:w="70" w:type="dxa"/>
-              <w:left w:w="100" w:type="dxa"/>
-              <w:bottom w:w="70" w:type="dxa"/>
+              <w:top w:w="65" w:type="dxa"/>
+              <w:left w:w="100" w:type="dxa"/>
+              <w:bottom w:w="65" w:type="dxa"/>
               <w:right w:w="100" w:type="dxa"/>
             </w:tcMar>
           </w:tcPr>
@@ -1476,8 +1435,8 @@
               <w:rPr>
                 <w:b/>
                 <w:bCs/>
-                <w:sz w:val="18"/>
-                <w:szCs w:val="18"/>
+                <w:sz w:val="17"/>
+                <w:szCs w:val="17"/>
               </w:rPr>
               <w:t>Matching</w:t>
             </w:r>
@@ -1485,46 +1444,39 @@
         </w:tc>
         <w:tc>
           <w:tcPr>
-            <w:tcW w:w="3880" w:type="dxa"/>
-            <w:tcMar>
-              <w:top w:w="70" w:type="dxa"/>
-              <w:left w:w="100" w:type="dxa"/>
-              <w:bottom w:w="70" w:type="dxa"/>
-              <w:right w:w="100" w:type="dxa"/>
-            </w:tcMar>
-          </w:tcPr>
-          <w:p>
-            <w:r>
-              <w:rPr>
-                <w:sz w:val="18"/>
-                <w:szCs w:val="18"/>
-              </w:rPr>
-              <w:t>A staff member types the request into a simple search screen and gets a ranked list in seconds, instead of scrolling through E</w:t>
-            </w:r>
-            <w:r>
-              <w:rPr>
-                <w:sz w:val="18"/>
-                <w:szCs w:val="18"/>
-              </w:rPr>
-              <w:t>xcel</w:t>
-            </w:r>
-          </w:p>
-        </w:tc>
-        <w:tc>
-          <w:tcPr>
-            <w:tcW w:w="3880" w:type="dxa"/>
-            <w:tcMar>
-              <w:top w:w="70" w:type="dxa"/>
-              <w:left w:w="100" w:type="dxa"/>
-              <w:bottom w:w="70" w:type="dxa"/>
-              <w:right w:w="100" w:type="dxa"/>
-            </w:tcMar>
-          </w:tcPr>
-          <w:p>
-            <w:r>
-              <w:rPr>
-                <w:sz w:val="18"/>
-                <w:szCs w:val="18"/>
+            <w:tcW w:w="4250" w:type="dxa"/>
+            <w:tcMar>
+              <w:top w:w="65" w:type="dxa"/>
+              <w:left w:w="100" w:type="dxa"/>
+              <w:bottom w:w="65" w:type="dxa"/>
+              <w:right w:w="100" w:type="dxa"/>
+            </w:tcMar>
+          </w:tcPr>
+          <w:p>
+            <w:r>
+              <w:rPr>
+                <w:sz w:val="17"/>
+                <w:szCs w:val="17"/>
+              </w:rPr>
+              <w:t>A staff member types the request into a simple search screen and gets a ranked list in seconds, instead of scrolling through Excel</w:t>
+            </w:r>
+          </w:p>
+        </w:tc>
+        <w:tc>
+          <w:tcPr>
+            <w:tcW w:w="4250" w:type="dxa"/>
+            <w:tcMar>
+              <w:top w:w="65" w:type="dxa"/>
+              <w:left w:w="100" w:type="dxa"/>
+              <w:bottom w:w="65" w:type="dxa"/>
+              <w:right w:w="100" w:type="dxa"/>
+            </w:tcMar>
+          </w:tcPr>
+          <w:p>
+            <w:r>
+              <w:rPr>
+                <w:sz w:val="17"/>
+                <w:szCs w:val="17"/>
               </w:rPr>
               <w:t>Incoming emails are read and matched automatically, with nothing retyped</w:t>
             </w:r>
@@ -1543,9 +1495,9 @@
             <w:tcW w:w="1600" w:type="dxa"/>
             <w:shd w:val="clear" w:color="auto" w:fill="F3F4F6"/>
             <w:tcMar>
-              <w:top w:w="70" w:type="dxa"/>
-              <w:left w:w="100" w:type="dxa"/>
-              <w:bottom w:w="70" w:type="dxa"/>
+              <w:top w:w="65" w:type="dxa"/>
+              <w:left w:w="100" w:type="dxa"/>
+              <w:bottom w:w="65" w:type="dxa"/>
               <w:right w:w="100" w:type="dxa"/>
             </w:tcMar>
           </w:tcPr>
@@ -1554,28 +1506,37 @@
               <w:rPr>
                 <w:b/>
                 <w:bCs/>
-                <w:sz w:val="18"/>
-                <w:szCs w:val="18"/>
-              </w:rPr>
-              <w:t>Email handling</w:t>
-            </w:r>
-          </w:p>
-        </w:tc>
-        <w:tc>
-          <w:tcPr>
-            <w:tcW w:w="3880" w:type="dxa"/>
-            <w:tcMar>
-              <w:top w:w="70" w:type="dxa"/>
-              <w:left w:w="100" w:type="dxa"/>
-              <w:bottom w:w="70" w:type="dxa"/>
-              <w:right w:w="100" w:type="dxa"/>
-            </w:tcMar>
-          </w:tcPr>
-          <w:p>
-            <w:r>
-              <w:rPr>
-                <w:sz w:val="18"/>
-                <w:szCs w:val="18"/>
+                <w:sz w:val="17"/>
+                <w:szCs w:val="17"/>
+              </w:rPr>
+              <w:t>Email h</w:t>
+            </w:r>
+            <w:r>
+              <w:rPr>
+                <w:b/>
+                <w:bCs/>
+                <w:sz w:val="17"/>
+                <w:szCs w:val="17"/>
+              </w:rPr>
+              <w:t>andling</w:t>
+            </w:r>
+          </w:p>
+        </w:tc>
+        <w:tc>
+          <w:tcPr>
+            <w:tcW w:w="4250" w:type="dxa"/>
+            <w:tcMar>
+              <w:top w:w="65" w:type="dxa"/>
+              <w:left w:w="100" w:type="dxa"/>
+              <w:bottom w:w="65" w:type="dxa"/>
+              <w:right w:w="100" w:type="dxa"/>
+            </w:tcMar>
+          </w:tcPr>
+          <w:p>
+            <w:r>
+              <w:rPr>
+                <w:sz w:val="17"/>
+                <w:szCs w:val="17"/>
               </w:rPr>
               <w:t>Still read and handled by a person</w:t>
             </w:r>
@@ -1583,19 +1544,19 @@
         </w:tc>
         <w:tc>
           <w:tcPr>
-            <w:tcW w:w="3880" w:type="dxa"/>
-            <w:tcMar>
-              <w:top w:w="70" w:type="dxa"/>
-              <w:left w:w="100" w:type="dxa"/>
-              <w:bottom w:w="70" w:type="dxa"/>
-              <w:right w:w="100" w:type="dxa"/>
-            </w:tcMar>
-          </w:tcPr>
-          <w:p>
-            <w:r>
-              <w:rPr>
-                <w:sz w:val="18"/>
-                <w:szCs w:val="18"/>
+            <w:tcW w:w="4250" w:type="dxa"/>
+            <w:tcMar>
+              <w:top w:w="65" w:type="dxa"/>
+              <w:left w:w="100" w:type="dxa"/>
+              <w:bottom w:w="65" w:type="dxa"/>
+              <w:right w:w="100" w:type="dxa"/>
+            </w:tcMar>
+          </w:tcPr>
+          <w:p>
+            <w:r>
+              <w:rPr>
+                <w:sz w:val="17"/>
+                <w:szCs w:val="17"/>
               </w:rPr>
               <w:t>Incoming emails are checked automatically; sending a shortlist is a single click</w:t>
             </w:r>
@@ -1614,9 +1575,9 @@
             <w:tcW w:w="1600" w:type="dxa"/>
             <w:shd w:val="clear" w:color="auto" w:fill="F3F4F6"/>
             <w:tcMar>
-              <w:top w:w="70" w:type="dxa"/>
-              <w:left w:w="100" w:type="dxa"/>
-              <w:bottom w:w="70" w:type="dxa"/>
+              <w:top w:w="65" w:type="dxa"/>
+              <w:left w:w="100" w:type="dxa"/>
+              <w:bottom w:w="65" w:type="dxa"/>
               <w:right w:w="100" w:type="dxa"/>
             </w:tcMar>
           </w:tcPr>
@@ -1625,8 +1586,8 @@
               <w:rPr>
                 <w:b/>
                 <w:bCs/>
-                <w:sz w:val="18"/>
-                <w:szCs w:val="18"/>
+                <w:sz w:val="17"/>
+                <w:szCs w:val="17"/>
               </w:rPr>
               <w:t>Quality check</w:t>
             </w:r>
@@ -1634,48 +1595,41 @@
         </w:tc>
         <w:tc>
           <w:tcPr>
-            <w:tcW w:w="3880" w:type="dxa"/>
-            <w:tcMar>
-              <w:top w:w="70" w:type="dxa"/>
-              <w:left w:w="100" w:type="dxa"/>
-              <w:bottom w:w="70" w:type="dxa"/>
-              <w:right w:w="100" w:type="dxa"/>
-            </w:tcMar>
-          </w:tcPr>
-          <w:p>
-            <w:r>
-              <w:rPr>
-                <w:sz w:val="18"/>
-                <w:szCs w:val="18"/>
-              </w:rPr>
-              <w:t>None yet. This stage mainly est</w:t>
-            </w:r>
-            <w:r>
-              <w:rPr>
-                <w:sz w:val="18"/>
-                <w:szCs w:val="18"/>
-              </w:rPr>
-              <w:t>ablishes how long manual matching actually takes, as a baseline</w:t>
-            </w:r>
-          </w:p>
-        </w:tc>
-        <w:tc>
-          <w:tcPr>
-            <w:tcW w:w="3880" w:type="dxa"/>
-            <w:tcMar>
-              <w:top w:w="70" w:type="dxa"/>
-              <w:left w:w="100" w:type="dxa"/>
-              <w:bottom w:w="70" w:type="dxa"/>
-              <w:right w:w="100" w:type="dxa"/>
-            </w:tcMar>
-          </w:tcPr>
-          <w:p>
-            <w:r>
-              <w:rPr>
-                <w:sz w:val="18"/>
-                <w:szCs w:val="18"/>
-              </w:rPr>
-              <w:t>Match quality and review time are tracked weekly against that baseline</w:t>
+            <w:tcW w:w="4250" w:type="dxa"/>
+            <w:tcMar>
+              <w:top w:w="65" w:type="dxa"/>
+              <w:left w:w="100" w:type="dxa"/>
+              <w:bottom w:w="65" w:type="dxa"/>
+              <w:right w:w="100" w:type="dxa"/>
+            </w:tcMar>
+          </w:tcPr>
+          <w:p>
+            <w:r>
+              <w:rPr>
+                <w:sz w:val="17"/>
+                <w:szCs w:val="17"/>
+              </w:rPr>
+              <w:t>None yet. This stage establishes how long manual matching takes, and how often it leads to a reply, as a baseline</w:t>
+            </w:r>
+          </w:p>
+        </w:tc>
+        <w:tc>
+          <w:tcPr>
+            <w:tcW w:w="4250" w:type="dxa"/>
+            <w:tcMar>
+              <w:top w:w="65" w:type="dxa"/>
+              <w:left w:w="100" w:type="dxa"/>
+              <w:bottom w:w="65" w:type="dxa"/>
+              <w:right w:w="100" w:type="dxa"/>
+            </w:tcMar>
+          </w:tcPr>
+          <w:p>
+            <w:r>
+              <w:rPr>
+                <w:sz w:val="17"/>
+                <w:szCs w:val="17"/>
+              </w:rPr>
+              <w:t>Precision, review time, and reply rate tracked weekly against that baseline</w:t>
             </w:r>
           </w:p>
         </w:tc>
@@ -1692,9 +1646,9 @@
             <w:tcW w:w="1600" w:type="dxa"/>
             <w:shd w:val="clear" w:color="auto" w:fill="F3F4F6"/>
             <w:tcMar>
-              <w:top w:w="70" w:type="dxa"/>
-              <w:left w:w="100" w:type="dxa"/>
-              <w:bottom w:w="70" w:type="dxa"/>
+              <w:top w:w="65" w:type="dxa"/>
+              <w:left w:w="100" w:type="dxa"/>
+              <w:bottom w:w="65" w:type="dxa"/>
               <w:right w:w="100" w:type="dxa"/>
             </w:tcMar>
           </w:tcPr>
@@ -1703,8 +1657,8 @@
               <w:rPr>
                 <w:b/>
                 <w:bCs/>
-                <w:sz w:val="18"/>
-                <w:szCs w:val="18"/>
+                <w:sz w:val="17"/>
+                <w:szCs w:val="17"/>
               </w:rPr>
               <w:t>Outcome</w:t>
             </w:r>
@@ -1712,19 +1666,19 @@
         </w:tc>
         <w:tc>
           <w:tcPr>
-            <w:tcW w:w="3880" w:type="dxa"/>
-            <w:tcMar>
-              <w:top w:w="70" w:type="dxa"/>
-              <w:left w:w="100" w:type="dxa"/>
-              <w:bottom w:w="70" w:type="dxa"/>
-              <w:right w:w="100" w:type="dxa"/>
-            </w:tcMar>
-          </w:tcPr>
-          <w:p>
-            <w:r>
-              <w:rPr>
-                <w:sz w:val="18"/>
-                <w:szCs w:val="18"/>
+            <w:tcW w:w="4250" w:type="dxa"/>
+            <w:tcMar>
+              <w:top w:w="65" w:type="dxa"/>
+              <w:left w:w="100" w:type="dxa"/>
+              <w:bottom w:w="65" w:type="dxa"/>
+              <w:right w:w="100" w:type="dxa"/>
+            </w:tcMar>
+          </w:tcPr>
+          <w:p>
+            <w:r>
+              <w:rPr>
+                <w:sz w:val="17"/>
+                <w:szCs w:val="17"/>
               </w:rPr>
               <w:t>Removes most of the manual searching straight away, with very little build risk</w:t>
             </w:r>
@@ -1732,19 +1686,19 @@
         </w:tc>
         <w:tc>
           <w:tcPr>
-            <w:tcW w:w="3880" w:type="dxa"/>
-            <w:tcMar>
-              <w:top w:w="70" w:type="dxa"/>
-              <w:left w:w="100" w:type="dxa"/>
-              <w:bottom w:w="70" w:type="dxa"/>
-              <w:right w:w="100" w:type="dxa"/>
-            </w:tcMar>
-          </w:tcPr>
-          <w:p>
-            <w:r>
-              <w:rPr>
-                <w:sz w:val="18"/>
-                <w:szCs w:val="18"/>
+            <w:tcW w:w="4250" w:type="dxa"/>
+            <w:tcMar>
+              <w:top w:w="65" w:type="dxa"/>
+              <w:left w:w="100" w:type="dxa"/>
+              <w:bottom w:w="65" w:type="dxa"/>
+              <w:right w:w="100" w:type="dxa"/>
+            </w:tcMar>
+          </w:tcPr>
+          <w:p>
+            <w:r>
+              <w:rPr>
+                <w:sz w:val="17"/>
+                <w:szCs w:val="17"/>
               </w:rPr>
               <w:t>Two apps running smoothly side by side, and very little manual work left per request</w:t>
             </w:r>
@@ -1754,30 +1708,38 @@
     </w:tbl>
     <w:p>
       <w:pPr>
-        <w:spacing w:after="100"/>
-      </w:pPr>
-      <w:r>
-        <w:rPr>
-          <w:sz w:val="6"/>
-          <w:szCs w:val="6"/>
+        <w:spacing w:after="90"/>
+      </w:pPr>
+      <w:r>
+        <w:rPr>
+          <w:sz w:val="5"/>
+          <w:szCs w:val="5"/>
         </w:rPr>
         <w:t xml:space="preserve"> </w:t>
       </w:r>
     </w:p>
     <w:p>
       <w:pPr>
-        <w:spacing w:after="100"/>
-      </w:pPr>
-      <w:r>
-        <w:t xml:space="preserve">Week 1 is about proving the idea works quickly and measuring the real baseline. Month 3 </w:t>
-      </w:r>
-      <w:r>
-        <w:t>is about giving it a proper, separate home once the rules have been tested against real requests.</w:t>
+        <w:spacing w:after="90"/>
+      </w:pPr>
+      <w:r>
+        <w:rPr>
+          <w:sz w:val="19"/>
+          <w:szCs w:val="19"/>
+        </w:rPr>
+        <w:t>The</w:t>
+      </w:r>
+      <w:r>
+        <w:rPr>
+          <w:sz w:val="19"/>
+          <w:szCs w:val="19"/>
+        </w:rPr>
+        <w:t xml:space="preserve"> main risks are a bad data import, a spike in requests, or the one person who knows the system being unavailable. All three are handled by the same human-review step, straightforward monitoring, and documentation that doesn't depend on one person's memory.</w:t>
       </w:r>
     </w:p>
     <w:sectPr>
-      <w:pgSz w:w="12240" w:h="15840"/>
-      <w:pgMar w:top="900" w:right="1080" w:bottom="900" w:left="1080" w:header="708" w:footer="708" w:gutter="0"/>
+      <w:pgSz w:w="11906" w:h="16838"/>
+      <w:pgMar w:top="820" w:right="900" w:bottom="820" w:left="900" w:header="708" w:footer="708" w:gutter="0"/>
       <w:cols w:space="720"/>
       <w:docGrid w:linePitch="360"/>
     </w:sectPr>
@@ -1788,10 +1750,10 @@
 <file path=word/numbering.xml><?xml version="1.0" encoding="utf-8"?>
 <w:numbering xmlns:wpc="http://schemas.microsoft.com/office/word/2010/wordprocessingCanvas" xmlns:cx="http://schemas.microsoft.com/office/drawing/2014/chartex" xmlns:cx1="http://schemas.microsoft.com/office/drawing/2015/9/8/chartex" xmlns:cx2="http://schemas.microsoft.com/office/drawing/2015/10/21/chartex" xmlns:cx3="http://schemas.microsoft.com/office/drawing/2016/5/9/chartex" xmlns:cx4="http://schemas.microsoft.com/office/drawing/2016/5/10/chartex" xmlns:cx5="http://schemas.microsoft.com/office/drawing/2016/5/11/chartex" xmlns:cx6="http://schemas.microsoft.com/office/drawing/2016/5/12/chartex" xmlns:cx7="http://schemas.microsoft.com/office/drawing/2016/5/13/chartex" xmlns:cx8="http://schemas.microsoft.com/office/drawing/2016/5/14/chartex" xmlns:mc="http://schemas.openxmlformats.org/markup-compatibility/2006" xmlns:aink="http://schemas.microsoft.com/office/drawing/2016/ink" xmlns:am3d="http://schemas.microsoft.com/office/drawing/2017/model3d" xmlns:o="urn:schemas-microsoft-com:office:office" xmlns:r="http://schemas.openxmlformats.org/officeDocument/2006/relationships" xmlns:m="http://schemas.openxmlformats.org/officeDocument/2006/math" xmlns:v="urn:schemas-microsoft-com:vml" xmlns:wp14="http://schemas.microsoft.com/office/word/2010/wordprocessingDrawing" xmlns:wp="http://schemas.openxmlformats.org/drawingml/2006/wordprocessingDrawing" xmlns:w10="urn:schemas-microsoft-com:office:word" xmlns:w="http://schemas.openxmlformats.org/wordprocessingml/2006/main" xmlns:w14="http://schemas.microsoft.com/office/word/2010/wordml" xmlns:w15="http://schemas.microsoft.com/office/word/2012/wordml" xmlns:w16cex="http://schemas.microsoft.com/office/word/2018/wordml/cex" xmlns:w16cid="http://schemas.microsoft.com/office/word/2016/wordml/cid" xmlns:w16="http://schemas.microsoft.com/office/word/2018/wordml" xmlns:w16sdtdh="http://schemas.microsoft.com/office/word/2020/wordml/sdtdatahash" xmlns:w16se="http://schemas.microsoft.com/office/word/2015/wordml/symex" xmlns:wpg="http://schemas.microsoft.com/office/word/2010/wordprocessingGroup" xmlns:wpi="http://schemas.microsoft.com/office/word/2010/wordprocessingInk" xmlns:wne="http://schemas.microsoft.com/office/word/2006/wordml" xmlns:wps="http://schemas.microsoft.com/office/word/2010/wordprocessingShape" mc:Ignorable="w14 w15 w16se w16cid w16 w16cex w16sdtdh wp14">
   <w:abstractNum w:abstractNumId="0" w15:restartNumberingAfterBreak="0">
-    <w:nsid w:val="03730A28"/>
+    <w:nsid w:val="1A2B1172"/>
     <w:multiLevelType w:val="hybridMultilevel"/>
-    <w:tmpl w:val="988CC48A"/>
-    <w:lvl w:ilvl="0" w:tplc="781A1A48">
+    <w:tmpl w:val="00BC6502"/>
+    <w:lvl w:ilvl="0" w:tplc="834C8E20">
       <w:start w:val="1"/>
       <w:numFmt w:val="bullet"/>
       <w:lvlText w:val="●"/>
@@ -1800,7 +1762,7 @@
         <w:ind w:left="720" w:hanging="360"/>
       </w:pPr>
     </w:lvl>
-    <w:lvl w:ilvl="1" w:tplc="8488E0EA">
+    <w:lvl w:ilvl="1" w:tplc="D0BE9D6C">
       <w:start w:val="1"/>
       <w:numFmt w:val="bullet"/>
       <w:lvlText w:val="○"/>
@@ -1809,7 +1771,7 @@
         <w:ind w:left="1440" w:hanging="360"/>
       </w:pPr>
     </w:lvl>
-    <w:lvl w:ilvl="2" w:tplc="F104EBF6">
+    <w:lvl w:ilvl="2" w:tplc="B580A224">
       <w:start w:val="1"/>
       <w:numFmt w:val="bullet"/>
       <w:lvlText w:val="■"/>
@@ -1818,7 +1780,7 @@
         <w:ind w:left="2160" w:hanging="360"/>
       </w:pPr>
     </w:lvl>
-    <w:lvl w:ilvl="3" w:tplc="ECF4F4DE">
+    <w:lvl w:ilvl="3" w:tplc="D2C208D4">
       <w:start w:val="1"/>
       <w:numFmt w:val="bullet"/>
       <w:lvlText w:val="●"/>
@@ -1827,7 +1789,7 @@
         <w:ind w:left="2880" w:hanging="360"/>
       </w:pPr>
     </w:lvl>
-    <w:lvl w:ilvl="4" w:tplc="897A865E">
+    <w:lvl w:ilvl="4" w:tplc="F4D2BFAA">
       <w:start w:val="1"/>
       <w:numFmt w:val="bullet"/>
       <w:lvlText w:val="○"/>
@@ -1836,7 +1798,7 @@
         <w:ind w:left="3600" w:hanging="360"/>
       </w:pPr>
     </w:lvl>
-    <w:lvl w:ilvl="5" w:tplc="367A78CA">
+    <w:lvl w:ilvl="5" w:tplc="635AF13A">
       <w:start w:val="1"/>
       <w:numFmt w:val="bullet"/>
       <w:lvlText w:val="■"/>
@@ -1845,7 +1807,7 @@
         <w:ind w:left="4320" w:hanging="360"/>
       </w:pPr>
     </w:lvl>
-    <w:lvl w:ilvl="6" w:tplc="83A4CBDC">
+    <w:lvl w:ilvl="6" w:tplc="ED16FA6A">
       <w:start w:val="1"/>
       <w:numFmt w:val="bullet"/>
       <w:lvlText w:val="●"/>
@@ -1854,7 +1816,7 @@
         <w:ind w:left="5040" w:hanging="360"/>
       </w:pPr>
     </w:lvl>
-    <w:lvl w:ilvl="7" w:tplc="4828B38C">
+    <w:lvl w:ilvl="7" w:tplc="5CDCE0EA">
       <w:start w:val="1"/>
       <w:numFmt w:val="bullet"/>
       <w:lvlText w:val="●"/>
@@ -1863,7 +1825,7 @@
         <w:ind w:left="5760" w:hanging="360"/>
       </w:pPr>
     </w:lvl>
-    <w:lvl w:ilvl="8" w:tplc="884C69DE">
+    <w:lvl w:ilvl="8" w:tplc="0BD41A00">
       <w:start w:val="1"/>
       <w:numFmt w:val="bullet"/>
       <w:lvlText w:val="●"/>
@@ -1874,54 +1836,54 @@
     </w:lvl>
   </w:abstractNum>
   <w:abstractNum w:abstractNumId="1" w15:restartNumberingAfterBreak="0">
-    <w:nsid w:val="6C10719B"/>
+    <w:nsid w:val="7065160B"/>
     <w:multiLevelType w:val="hybridMultilevel"/>
-    <w:tmpl w:val="17C891E0"/>
-    <w:lvl w:ilvl="0" w:tplc="B9628E0C">
+    <w:tmpl w:val="D2AED5CA"/>
+    <w:lvl w:ilvl="0" w:tplc="50CACEC8">
       <w:start w:val="1"/>
       <w:numFmt w:val="bullet"/>
       <w:lvlText w:val="•"/>
       <w:lvlJc w:val="left"/>
       <w:pPr>
-        <w:ind w:left="360" w:hanging="260"/>
+        <w:ind w:left="340" w:hanging="240"/>
       </w:pPr>
     </w:lvl>
-    <w:lvl w:ilvl="1" w:tplc="EDF20D60">
+    <w:lvl w:ilvl="1" w:tplc="87B482DE">
       <w:numFmt w:val="decimal"/>
       <w:lvlText w:val=""/>
       <w:lvlJc w:val="left"/>
     </w:lvl>
-    <w:lvl w:ilvl="2" w:tplc="5D10B762">
+    <w:lvl w:ilvl="2" w:tplc="10FAB020">
       <w:numFmt w:val="decimal"/>
       <w:lvlText w:val=""/>
       <w:lvlJc w:val="left"/>
     </w:lvl>
-    <w:lvl w:ilvl="3" w:tplc="C5FCDF40">
+    <w:lvl w:ilvl="3" w:tplc="61D4582A">
       <w:numFmt w:val="decimal"/>
       <w:lvlText w:val=""/>
       <w:lvlJc w:val="left"/>
     </w:lvl>
-    <w:lvl w:ilvl="4" w:tplc="3C3E738E">
+    <w:lvl w:ilvl="4" w:tplc="AFD4093A">
       <w:numFmt w:val="decimal"/>
       <w:lvlText w:val=""/>
       <w:lvlJc w:val="left"/>
     </w:lvl>
-    <w:lvl w:ilvl="5" w:tplc="90CA1972">
+    <w:lvl w:ilvl="5" w:tplc="323EBD30">
       <w:numFmt w:val="decimal"/>
       <w:lvlText w:val=""/>
       <w:lvlJc w:val="left"/>
     </w:lvl>
-    <w:lvl w:ilvl="6" w:tplc="78943E2A">
+    <w:lvl w:ilvl="6" w:tplc="94A061AA">
       <w:numFmt w:val="decimal"/>
       <w:lvlText w:val=""/>
       <w:lvlJc w:val="left"/>
     </w:lvl>
-    <w:lvl w:ilvl="7" w:tplc="61F205F0">
+    <w:lvl w:ilvl="7" w:tplc="4306946E">
       <w:numFmt w:val="decimal"/>
       <w:lvlText w:val=""/>
       <w:lvlJc w:val="left"/>
     </w:lvl>
-    <w:lvl w:ilvl="8" w:tplc="3B6A997E">
+    <w:lvl w:ilvl="8" w:tplc="C1FC9D6A">
       <w:numFmt w:val="decimal"/>
       <w:lvlText w:val=""/>
       <w:lvlJc w:val="left"/>

</xml_diff>